<commit_message>
feat: complete comprehensive review revisions across model, deck, memo, hub and landing page
</commit_message>
<xml_diff>
--- a/deliverables/BrightCHAMPS_USA_Q4_Strategy_Memo.docx
+++ b/deliverables/BrightCHAMPS_USA_Q4_Strategy_Memo.docx
@@ -11,21 +11,21 @@
           <w:rFonts w:ascii="Calibri" w:hAnsi="Calibri"/>
           <w:b/>
           <w:color w:val="1E1B4B"/>
-          <w:sz w:val="40"/>
+          <w:sz w:val="36"/>
         </w:rPr>
         <w:t>BrightCHAMPS USA: Q4 Growth &amp; Expansion Strategy</w:t>
       </w:r>
     </w:p>
     <w:p>
       <w:pPr>
-        <w:spacing w:before="0" w:after="200"/>
+        <w:spacing w:before="0" w:after="160"/>
       </w:pPr>
       <w:r>
         <w:rPr>
           <w:rFonts w:ascii="Calibri" w:hAnsi="Calibri"/>
           <w:b/>
           <w:color w:val="4338CA"/>
-          <w:sz w:val="20"/>
+          <w:sz w:val="19"/>
         </w:rPr>
         <w:t>EXECUTIVE STRATEGY MEMO &amp; TECHNICAL RUNBOOK • FOUNDER'S OFFICE (NOV–DEC 2026)</w:t>
       </w:r>
@@ -45,19 +45,19 @@
         </w:tblBorders>
       </w:tblPr>
       <w:tblGrid>
-        <w:gridCol w:w="5090"/>
-        <w:gridCol w:w="5090"/>
+        <w:gridCol w:w="5162"/>
+        <w:gridCol w:w="5162"/>
       </w:tblGrid>
       <w:tr>
         <w:tc>
           <w:tcPr>
-            <w:tcW w:type="dxa" w:w="1728"/>
+            <w:tcW w:type="dxa" w:w="1584"/>
             <w:shd w:fill="F8FAFC"/>
             <w:tcMar>
-              <w:top w:w="30" w:type="dxa"/>
-              <w:bottom w:w="30" w:type="dxa"/>
-              <w:left w:w="60" w:type="dxa"/>
-              <w:right w:w="60" w:type="dxa"/>
+              <w:top w:w="25" w:type="dxa"/>
+              <w:bottom w:w="25" w:type="dxa"/>
+              <w:left w:w="50" w:type="dxa"/>
+              <w:right w:w="50" w:type="dxa"/>
             </w:tcMar>
           </w:tcPr>
           <w:p>
@@ -66,7 +66,7 @@
                 <w:rFonts w:ascii="Calibri" w:hAnsi="Calibri"/>
                 <w:b/>
                 <w:color w:val="1E1B4B"/>
-                <w:sz w:val="17"/>
+                <w:sz w:val="16"/>
               </w:rPr>
               <w:t>TO:</w:t>
             </w:r>
@@ -74,13 +74,13 @@
         </w:tc>
         <w:tc>
           <w:tcPr>
-            <w:tcW w:type="dxa" w:w="8453"/>
+            <w:tcW w:type="dxa" w:w="8741"/>
             <w:shd w:fill="F8FAFC"/>
             <w:tcMar>
-              <w:top w:w="30" w:type="dxa"/>
-              <w:bottom w:w="30" w:type="dxa"/>
-              <w:left w:w="60" w:type="dxa"/>
-              <w:right w:w="60" w:type="dxa"/>
+              <w:top w:w="25" w:type="dxa"/>
+              <w:bottom w:w="25" w:type="dxa"/>
+              <w:left w:w="50" w:type="dxa"/>
+              <w:right w:w="50" w:type="dxa"/>
             </w:tcMar>
           </w:tcPr>
           <w:p>
@@ -88,7 +88,7 @@
               <w:rPr>
                 <w:rFonts w:ascii="Calibri" w:hAnsi="Calibri"/>
                 <w:color w:val="1E293B"/>
-                <w:sz w:val="17"/>
+                <w:sz w:val="16"/>
               </w:rPr>
               <w:t>Yatharth Sahoo (Senior Lead, Founder's Office) &lt;yatharth.sahoo@brightchamps.com&gt;</w:t>
             </w:r>
@@ -98,13 +98,13 @@
       <w:tr>
         <w:tc>
           <w:tcPr>
-            <w:tcW w:type="dxa" w:w="1728"/>
+            <w:tcW w:type="dxa" w:w="1584"/>
             <w:shd w:fill="F8FAFC"/>
             <w:tcMar>
-              <w:top w:w="30" w:type="dxa"/>
-              <w:bottom w:w="30" w:type="dxa"/>
-              <w:left w:w="60" w:type="dxa"/>
-              <w:right w:w="60" w:type="dxa"/>
+              <w:top w:w="25" w:type="dxa"/>
+              <w:bottom w:w="25" w:type="dxa"/>
+              <w:left w:w="50" w:type="dxa"/>
+              <w:right w:w="50" w:type="dxa"/>
             </w:tcMar>
           </w:tcPr>
           <w:p>
@@ -113,7 +113,7 @@
                 <w:rFonts w:ascii="Calibri" w:hAnsi="Calibri"/>
                 <w:b/>
                 <w:color w:val="1E1B4B"/>
-                <w:sz w:val="17"/>
+                <w:sz w:val="16"/>
               </w:rPr>
               <w:t>FROM:</w:t>
             </w:r>
@@ -121,13 +121,13 @@
         </w:tc>
         <w:tc>
           <w:tcPr>
-            <w:tcW w:type="dxa" w:w="8453"/>
+            <w:tcW w:type="dxa" w:w="8741"/>
             <w:shd w:fill="F8FAFC"/>
             <w:tcMar>
-              <w:top w:w="30" w:type="dxa"/>
-              <w:bottom w:w="30" w:type="dxa"/>
-              <w:left w:w="60" w:type="dxa"/>
-              <w:right w:w="60" w:type="dxa"/>
+              <w:top w:w="25" w:type="dxa"/>
+              <w:bottom w:w="25" w:type="dxa"/>
+              <w:left w:w="50" w:type="dxa"/>
+              <w:right w:w="50" w:type="dxa"/>
             </w:tcMar>
           </w:tcPr>
           <w:p>
@@ -135,9 +135,9 @@
               <w:rPr>
                 <w:rFonts w:ascii="Calibri" w:hAnsi="Calibri"/>
                 <w:color w:val="1E293B"/>
-                <w:sz w:val="17"/>
+                <w:sz w:val="16"/>
               </w:rPr>
-              <w:t>Bharanee B (AI Associate, Founder's Office)</w:t>
+              <w:t>Bharanee B (AI Associate, Founder's Office) &lt;+91 7708221675&gt;</w:t>
             </w:r>
           </w:p>
         </w:tc>
@@ -145,13 +145,13 @@
       <w:tr>
         <w:tc>
           <w:tcPr>
-            <w:tcW w:type="dxa" w:w="1728"/>
+            <w:tcW w:type="dxa" w:w="1584"/>
             <w:shd w:fill="F8FAFC"/>
             <w:tcMar>
-              <w:top w:w="30" w:type="dxa"/>
-              <w:bottom w:w="30" w:type="dxa"/>
-              <w:left w:w="60" w:type="dxa"/>
-              <w:right w:w="60" w:type="dxa"/>
+              <w:top w:w="25" w:type="dxa"/>
+              <w:bottom w:w="25" w:type="dxa"/>
+              <w:left w:w="50" w:type="dxa"/>
+              <w:right w:w="50" w:type="dxa"/>
             </w:tcMar>
           </w:tcPr>
           <w:p>
@@ -160,7 +160,7 @@
                 <w:rFonts w:ascii="Calibri" w:hAnsi="Calibri"/>
                 <w:b/>
                 <w:color w:val="1E1B4B"/>
-                <w:sz w:val="17"/>
+                <w:sz w:val="16"/>
               </w:rPr>
               <w:t>DATE:</w:t>
             </w:r>
@@ -168,13 +168,13 @@
         </w:tc>
         <w:tc>
           <w:tcPr>
-            <w:tcW w:type="dxa" w:w="8453"/>
+            <w:tcW w:type="dxa" w:w="8741"/>
             <w:shd w:fill="F8FAFC"/>
             <w:tcMar>
-              <w:top w:w="30" w:type="dxa"/>
-              <w:bottom w:w="30" w:type="dxa"/>
-              <w:left w:w="60" w:type="dxa"/>
-              <w:right w:w="60" w:type="dxa"/>
+              <w:top w:w="25" w:type="dxa"/>
+              <w:bottom w:w="25" w:type="dxa"/>
+              <w:left w:w="50" w:type="dxa"/>
+              <w:right w:w="50" w:type="dxa"/>
             </w:tcMar>
           </w:tcPr>
           <w:p>
@@ -182,7 +182,7 @@
               <w:rPr>
                 <w:rFonts w:ascii="Calibri" w:hAnsi="Calibri"/>
                 <w:color w:val="1E293B"/>
-                <w:sz w:val="17"/>
+                <w:sz w:val="16"/>
               </w:rPr>
               <w:t>October 18, 2026</w:t>
             </w:r>
@@ -192,13 +192,13 @@
       <w:tr>
         <w:tc>
           <w:tcPr>
-            <w:tcW w:type="dxa" w:w="1728"/>
+            <w:tcW w:type="dxa" w:w="1584"/>
             <w:shd w:fill="F8FAFC"/>
             <w:tcMar>
-              <w:top w:w="30" w:type="dxa"/>
-              <w:bottom w:w="30" w:type="dxa"/>
-              <w:left w:w="60" w:type="dxa"/>
-              <w:right w:w="60" w:type="dxa"/>
+              <w:top w:w="25" w:type="dxa"/>
+              <w:bottom w:w="25" w:type="dxa"/>
+              <w:left w:w="50" w:type="dxa"/>
+              <w:right w:w="50" w:type="dxa"/>
             </w:tcMar>
           </w:tcPr>
           <w:p>
@@ -207,7 +207,7 @@
                 <w:rFonts w:ascii="Calibri" w:hAnsi="Calibri"/>
                 <w:b/>
                 <w:color w:val="1E1B4B"/>
-                <w:sz w:val="17"/>
+                <w:sz w:val="16"/>
               </w:rPr>
               <w:t>SUBJECT:</w:t>
             </w:r>
@@ -215,13 +215,13 @@
         </w:tc>
         <w:tc>
           <w:tcPr>
-            <w:tcW w:type="dxa" w:w="8453"/>
+            <w:tcW w:type="dxa" w:w="8741"/>
             <w:shd w:fill="F8FAFC"/>
             <w:tcMar>
-              <w:top w:w="30" w:type="dxa"/>
-              <w:bottom w:w="30" w:type="dxa"/>
-              <w:left w:w="60" w:type="dxa"/>
-              <w:right w:w="60" w:type="dxa"/>
+              <w:top w:w="25" w:type="dxa"/>
+              <w:bottom w:w="25" w:type="dxa"/>
+              <w:left w:w="50" w:type="dxa"/>
+              <w:right w:w="50" w:type="dxa"/>
             </w:tcMar>
           </w:tcPr>
           <w:p>
@@ -230,9 +230,9 @@
                 <w:rFonts w:ascii="Calibri" w:hAnsi="Calibri"/>
                 <w:b/>
                 <w:color w:val="1E293B"/>
-                <w:sz w:val="17"/>
+                <w:sz w:val="16"/>
               </w:rPr>
-              <w:t>USA Expansion: Scaling to 5,500 Leads @ $29.85 CPL via Geo-Marketing &amp; Product-Tech</w:t>
+              <w:t>USA Expansion: Scaling to 5,500 Qualified Leads @ $29.85 CPL via Geo-Marketing &amp; Product-Tech</w:t>
             </w:r>
           </w:p>
         </w:tc>
@@ -240,47 +240,47 @@
     </w:tbl>
     <w:p>
       <w:pPr>
-        <w:spacing w:after="80"/>
+        <w:spacing w:after="60"/>
       </w:pPr>
     </w:p>
     <w:p>
       <w:pPr>
-        <w:spacing w:before="200" w:after="60"/>
+        <w:spacing w:before="180" w:after="60"/>
       </w:pPr>
       <w:r>
         <w:rPr>
           <w:rFonts w:ascii="Calibri" w:hAnsi="Calibri"/>
           <w:b/>
           <w:color w:val="1E1B4B"/>
-          <w:sz w:val="24"/>
+          <w:sz w:val="23"/>
         </w:rPr>
         <w:t>1. Executive Summary &amp; One-Page Strategy Canvas</w:t>
       </w:r>
     </w:p>
     <w:p>
       <w:pPr>
-        <w:spacing w:before="0" w:after="60" w:line="276" w:lineRule="auto"/>
+        <w:spacing w:before="0" w:after="50" w:line="276" w:lineRule="auto"/>
       </w:pPr>
       <w:r>
         <w:rPr>
           <w:rFonts w:ascii="Calibri" w:hAnsi="Calibri"/>
           <w:color w:val="1E293B"/>
-          <w:sz w:val="18"/>
+          <w:sz w:val="17"/>
         </w:rPr>
         <w:t>BrightCHAMPS has mandated an aggressive Q4 expansion in the United States to generate 5,500 qualified leads across November (2,500) and December (3,000) at a strict blended Cost Per Lead (CPL) of $30.00 USD ('at the right cost') while maintaining premium lead quality.</w:t>
       </w:r>
     </w:p>
     <w:p>
       <w:pPr>
-        <w:spacing w:before="0" w:after="60" w:line="276" w:lineRule="auto"/>
+        <w:spacing w:before="0" w:after="50" w:line="276" w:lineRule="auto"/>
       </w:pPr>
       <w:r>
         <w:rPr>
           <w:rFonts w:ascii="Calibri" w:hAnsi="Calibri"/>
           <w:color w:val="1E293B"/>
-          <w:sz w:val="18"/>
+          <w:sz w:val="17"/>
         </w:rPr>
-        <w:t>We recommend deploying a Dual-Pillar Engine: (1) Geo-Segmented Marketing targeting high-propensity STEM families via compliant Meta proxies, balanced across premium tech hubs and cost-efficient suburban corridors, and (2) Product-Tech Automation with server-side Meta CAPI monotonic values (P(Paid | Stage) x ARPU) optimized on calendar bookings ('Schedule'), paired with dynamic intake that locks demos within &lt;=48 hours.</w:t>
+        <w:t>We recommend deploying a Dual-Pillar Engine: (1) Geo-Segmented Marketing targeting high-propensity STEM families via compliant Meta proxies, paired with a 10-15% broad/Advantage+ control arm, and (2) Product-Tech Automation with server-side Meta CAPI v21.0 monotonic values (P(Paid | Stage) x ARPU) optimized on calendar bookings ('Schedule'), paired with dynamic intake that locks demos within &lt;=48 hours.</w:t>
       </w:r>
     </w:p>
     <w:tbl>
@@ -290,18 +290,18 @@
         <w:tblLook w:firstColumn="1" w:firstRow="1" w:lastColumn="0" w:lastRow="0" w:noHBand="0" w:noVBand="1" w:val="04A0"/>
       </w:tblPr>
       <w:tblGrid>
-        <w:gridCol w:w="10181"/>
+        <w:gridCol w:w="10325"/>
       </w:tblGrid>
       <w:tr>
         <w:tc>
           <w:tcPr>
-            <w:tcW w:type="dxa" w:w="10181"/>
+            <w:tcW w:type="dxa" w:w="10325"/>
             <w:shd w:fill="EEF2FF"/>
             <w:tcMar>
-              <w:top w:w="80" w:type="dxa"/>
-              <w:bottom w:w="80" w:type="dxa"/>
-              <w:left w:w="120" w:type="dxa"/>
-              <w:right w:w="120" w:type="dxa"/>
+              <w:top w:w="60" w:type="dxa"/>
+              <w:bottom w:w="60" w:type="dxa"/>
+              <w:left w:w="100" w:type="dxa"/>
+              <w:right w:w="100" w:type="dxa"/>
             </w:tcMar>
             <w:tcBorders>
               <w:left w:val="single" w:sz="24" w:space="0" w:color="4338CA"/>
@@ -319,7 +319,7 @@
                 <w:rFonts w:ascii="Calibri" w:hAnsi="Calibri"/>
                 <w:b/>
                 <w:color w:val="4338CA"/>
-                <w:sz w:val="17"/>
+                <w:sz w:val="16"/>
               </w:rPr>
               <w:t>[EXECUTIVE SCORECARD &amp; IMMEDIATE ASK]</w:t>
               <w:br/>
@@ -328,32 +328,30 @@
               <w:rPr>
                 <w:rFonts w:ascii="Calibri" w:hAnsi="Calibri"/>
                 <w:color w:val="1E293B"/>
-                <w:sz w:val="18"/>
+                <w:sz w:val="17"/>
               </w:rPr>
               <w:t>CORE SINGLE-SOURCE-OF-TRUTH SCORECARD:</w:t>
               <w:br/>
-              <w:t>• Total Leads: 5,500 (Nov: 2,500 | Dec: 3,000) | Blended CPL: $29.85 USD (Under $30.00 ceiling)</w:t>
+              <w:t>• Qualified Leads: 5,500 (Nov: 2,500 | Dec: 3,000) | Blended CPL: $29.85 USD (Spend: $164,175 vs $165k budget ceiling)</w:t>
               <w:br/>
-              <w:t>• Total Media Spend: $164,175.00 USD (Under $165,000 ceiling by -$825.00 buffer)</w:t>
+              <w:t>• Funnel Throughput: 3,723 Demos Booked (67.7%) -&gt; 2,643 Attended (71.0% show rate) -&gt; 473 Paid Enrollments (17.9% close)</w:t>
               <w:br/>
-              <w:t>• Demos Scheduled: 3,723 Demos (67.7%) | Demos Attended: 2,643 Demos (71.0% Show Rate)</w:t>
+              <w:t>• Cost Per Attended Demo (North Star KPI): $62.12 USD ($164,175 / 2,643 attended demos)</w:t>
               <w:br/>
-              <w:t>• Paid Enrolled Students: 473 Students (17.9% close | 8.60% full-funnel lead-to-paid)</w:t>
+              <w:t>• Lead-to-Paid Conversion: 8.60% (deliberately sitting ~10% below Round 1 US actual of 9.5%)</w:t>
               <w:br/>
-              <w:t>• Net Booked Revenue: $367,550.00 USD (Gross list $414,850 - $47,300 promo voucher dilution)</w:t>
+              <w:t>• Net Booked Revenue: $367,550.00 USD | Revenue Less Media Spend: $203,375.00 USD | Blended CAC: $347.09</w:t>
               <w:br/>
-              <w:t>• Revenue Less Media Spend: $203,375.00 USD | Assumed Gross Margin: 55.0% (Assumed)</w:t>
+              <w:t>• Contribution Margin (at assumed 55.0% GM): $37,977.50 USD (10.3% margin before closers, payment fees, refunds, creative)</w:t>
               <w:br/>
-              <w:t>• Contribution Margin: $37,977.50 USD (After media &amp; instructional delivery COGS)</w:t>
+              <w:t>• First-Order Media ROAS: 2.24x (Break-Even ROAS: 1.82x) | First-Order GM LTV/CAC: 1.23x ($777.06 x 55% / $347.09)</w:t>
               <w:br/>
-              <w:t>• First-Order ROAS: 2.24x (Break-Even ROAS: 1.82x) | Blended CAC: $347.09 per student</w:t>
-              <w:br/>
-              <w:t>• Upfront Cash Collected (M1): $275,662.50 USD (75%) | 30-60 Day Installments: $91,887.50 USD (25%)</w:t>
+              <w:t>• Cash Timing (within 30d of lead): $275,662.50 USD (75% upfront liquidity; Dec paid leads trail into Jan)</w:t>
               <w:br/>
               <w:br/>
-              <w:t>TOP 2 RISKS: (1) BFCM Ad Auction Inflation (mitigated by front-loaded Nov 1-18 pacing &amp; $42 bid caps) and (2) Counselor Demo Bottlenecks (mitigated by dedicated 16-mentor US pod across EST/CST/PST).</w:t>
+              <w:t>TOP 2 RISKS: (1) BFCM Ad Auction Inflation (mitigated by front-loaded Nov 1-18 pacing, 50% Thanksgiving spend pause &amp; $42 bid caps) and (2) Weekend/Peak Demo Capacity (mitigated by 16-mentor pod + weekend daytime blocks &amp; 6 on-call flex mentors).</w:t>
               <w:br/>
-              <w:t>THE ASK: Leadership approval of $164,175 media plan, 16 dedicated US mentors, and $150 holiday voucher.</w:t>
+              <w:t>THE ASK: Leadership approval of $164,175 media plan, 16 dedicated US mentors + flex pool, and $150 holiday voucher A/B test.</w:t>
             </w:r>
           </w:p>
         </w:tc>
@@ -361,92 +359,34 @@
     </w:tbl>
     <w:p>
       <w:pPr>
-        <w:spacing w:after="60"/>
+        <w:spacing w:after="40"/>
       </w:pPr>
     </w:p>
     <w:p>
       <w:pPr>
-        <w:spacing w:before="200" w:after="60"/>
+        <w:spacing w:before="180" w:after="60"/>
       </w:pPr>
       <w:r>
         <w:rPr>
           <w:rFonts w:ascii="Calibri" w:hAnsi="Calibri"/>
           <w:b/>
           <w:color w:val="1E1B4B"/>
-          <w:sz w:val="24"/>
+          <w:sz w:val="23"/>
         </w:rPr>
-        <w:t>2. Pillar 1: Compliant Meta Targeting &amp; Mutually Exclusive Geos</w:t>
+        <w:t>2. Qualified Lead Definition &amp; Raw-to-Qualified Bridge</w:t>
       </w:r>
     </w:p>
     <w:p>
       <w:pPr>
-        <w:spacing w:before="120" w:after="40"/>
-      </w:pPr>
-      <w:r>
-        <w:rPr>
-          <w:rFonts w:ascii="Calibri" w:hAnsi="Calibri"/>
-          <w:b/>
-          <w:color w:val="4338CA"/>
-          <w:sz w:val="21"/>
-        </w:rPr>
-        <w:t>Compliant Targeting Mechanisms on Meta</w:t>
-      </w:r>
-    </w:p>
-    <w:p>
-      <w:pPr>
-        <w:spacing w:before="0" w:after="60" w:line="276" w:lineRule="auto"/>
+        <w:spacing w:before="0" w:after="50" w:line="276" w:lineRule="auto"/>
       </w:pPr>
       <w:r>
         <w:rPr>
           <w:rFonts w:ascii="Calibri" w:hAnsi="Calibri"/>
           <w:color w:val="1E293B"/>
-          <w:sz w:val="18"/>
+          <w:sz w:val="17"/>
         </w:rPr>
-        <w:t>Ethnic affinity targeting is prohibited and unavailable on Meta. We achieve precision targeting via 3 compliant operational proxies:</w:t>
-      </w:r>
-    </w:p>
-    <w:p>
-      <w:pPr>
-        <w:spacing w:before="0" w:after="60" w:line="276" w:lineRule="auto"/>
-      </w:pPr>
-      <w:r>
-        <w:rPr>
-          <w:rFonts w:ascii="Calibri" w:hAnsi="Calibri"/>
-          <w:color w:val="1E293B"/>
-          <w:sz w:val="18"/>
-        </w:rPr>
-        <w:t>1. High-Density Zip-Code Geo Clusters: Premier STEM school districts (Fremont 94539, Sunnyvale 94087, Frisco 75034, Edison 08820, Bellevue 98052).</w:t>
-        <w:br/>
-        <w:t>2. Academic &amp; Cultural Interest Proxies: Parents (30-55) indexing on Kumon, Russian School of Math (RSM), Mathnasium, Singapore Math, USACO, First Robotics, and Chess.com.</w:t>
-        <w:br/>
-        <w:t>3. 1% Lookalikes from US Customer Lists: Ingesting historical US paid customer seed lists (SHA-256 hashed emails/phones).</w:t>
-      </w:r>
-    </w:p>
-    <w:p>
-      <w:pPr>
-        <w:spacing w:before="120" w:after="40"/>
-      </w:pPr>
-      <w:r>
-        <w:rPr>
-          <w:rFonts w:ascii="Calibri" w:hAnsi="Calibri"/>
-          <w:b/>
-          <w:color w:val="4338CA"/>
-          <w:sz w:val="21"/>
-        </w:rPr>
-        <w:t>Mutually Exclusive 3-Tier Geographic Matrix &amp; Empirical Hypotheses</w:t>
-      </w:r>
-    </w:p>
-    <w:p>
-      <w:pPr>
-        <w:spacing w:before="0" w:after="60" w:line="276" w:lineRule="auto"/>
-      </w:pPr>
-      <w:r>
-        <w:rPr>
-          <w:rFonts w:ascii="Calibri" w:hAnsi="Calibri"/>
-          <w:color w:val="1E293B"/>
-          <w:sz w:val="18"/>
-        </w:rPr>
-        <w:t>To prevent internal auction self-competition, tier geos are strictly mutually exclusive and treated as testable operational hypotheses:</w:t>
+        <w:t>Because SMS OTP phone verification and laptop hardware access gates filter out unqualified leads after media is paid for, CPL on qualified leads is naturally higher than CPL on raw form fills. A Qualified Lead is defined as: (1) OTP-verified US mobile number, (2) Valid deliverable parent email, and (3) Self-reported laptop/desktop computer access for the trial class.</w:t>
       </w:r>
     </w:p>
     <w:tbl>
@@ -464,25 +404,611 @@
         </w:tblBorders>
       </w:tblPr>
       <w:tblGrid>
-        <w:gridCol w:w="1273"/>
-        <w:gridCol w:w="1273"/>
-        <w:gridCol w:w="1273"/>
-        <w:gridCol w:w="1273"/>
-        <w:gridCol w:w="1273"/>
-        <w:gridCol w:w="1273"/>
-        <w:gridCol w:w="1273"/>
-        <w:gridCol w:w="1273"/>
+        <w:gridCol w:w="2065"/>
+        <w:gridCol w:w="2065"/>
+        <w:gridCol w:w="2065"/>
+        <w:gridCol w:w="2065"/>
+        <w:gridCol w:w="2065"/>
       </w:tblGrid>
       <w:tr>
         <w:tc>
           <w:tcPr>
-            <w:tcW w:type="dxa" w:w="1273"/>
+            <w:tcW w:type="dxa" w:w="2065"/>
             <w:shd w:fill="1E1B4B"/>
             <w:tcMar>
-              <w:top w:w="40" w:type="dxa"/>
-              <w:bottom w:w="40" w:type="dxa"/>
-              <w:left w:w="30" w:type="dxa"/>
-              <w:right w:w="30" w:type="dxa"/>
+              <w:top w:w="30" w:type="dxa"/>
+              <w:bottom w:w="30" w:type="dxa"/>
+              <w:left w:w="25" w:type="dxa"/>
+              <w:right w:w="25" w:type="dxa"/>
+            </w:tcMar>
+          </w:tcPr>
+          <w:p>
+            <w:r>
+              <w:rPr>
+                <w:rFonts w:ascii="Calibri" w:hAnsi="Calibri"/>
+                <w:b/>
+                <w:color w:val="FFFFFF"/>
+                <w:sz w:val="16"/>
+              </w:rPr>
+              <w:t>Qualification Pass Rate</w:t>
+            </w:r>
+          </w:p>
+        </w:tc>
+        <w:tc>
+          <w:tcPr>
+            <w:tcW w:type="dxa" w:w="2065"/>
+            <w:shd w:fill="1E1B4B"/>
+            <w:tcMar>
+              <w:top w:w="30" w:type="dxa"/>
+              <w:bottom w:w="30" w:type="dxa"/>
+              <w:left w:w="25" w:type="dxa"/>
+              <w:right w:w="25" w:type="dxa"/>
+            </w:tcMar>
+          </w:tcPr>
+          <w:p>
+            <w:r>
+              <w:rPr>
+                <w:rFonts w:ascii="Calibri" w:hAnsi="Calibri"/>
+                <w:b/>
+                <w:color w:val="FFFFFF"/>
+                <w:sz w:val="16"/>
+              </w:rPr>
+              <w:t>Raw Leads Needed</w:t>
+            </w:r>
+          </w:p>
+        </w:tc>
+        <w:tc>
+          <w:tcPr>
+            <w:tcW w:type="dxa" w:w="2065"/>
+            <w:shd w:fill="1E1B4B"/>
+            <w:tcMar>
+              <w:top w:w="30" w:type="dxa"/>
+              <w:bottom w:w="30" w:type="dxa"/>
+              <w:left w:w="25" w:type="dxa"/>
+              <w:right w:w="25" w:type="dxa"/>
+            </w:tcMar>
+          </w:tcPr>
+          <w:p>
+            <w:r>
+              <w:rPr>
+                <w:rFonts w:ascii="Calibri" w:hAnsi="Calibri"/>
+                <w:b/>
+                <w:color w:val="FFFFFF"/>
+                <w:sz w:val="16"/>
+              </w:rPr>
+              <w:t>Target Qualified Leads</w:t>
+            </w:r>
+          </w:p>
+        </w:tc>
+        <w:tc>
+          <w:tcPr>
+            <w:tcW w:type="dxa" w:w="2065"/>
+            <w:shd w:fill="1E1B4B"/>
+            <w:tcMar>
+              <w:top w:w="30" w:type="dxa"/>
+              <w:bottom w:w="30" w:type="dxa"/>
+              <w:left w:w="25" w:type="dxa"/>
+              <w:right w:w="25" w:type="dxa"/>
+            </w:tcMar>
+          </w:tcPr>
+          <w:p>
+            <w:r>
+              <w:rPr>
+                <w:rFonts w:ascii="Calibri" w:hAnsi="Calibri"/>
+                <w:b/>
+                <w:color w:val="FFFFFF"/>
+                <w:sz w:val="16"/>
+              </w:rPr>
+              <w:t>Max Allowable Raw CPL</w:t>
+            </w:r>
+          </w:p>
+        </w:tc>
+        <w:tc>
+          <w:tcPr>
+            <w:tcW w:type="dxa" w:w="2065"/>
+            <w:shd w:fill="1E1B4B"/>
+            <w:tcMar>
+              <w:top w:w="30" w:type="dxa"/>
+              <w:bottom w:w="30" w:type="dxa"/>
+              <w:left w:w="25" w:type="dxa"/>
+              <w:right w:w="25" w:type="dxa"/>
+            </w:tcMar>
+          </w:tcPr>
+          <w:p>
+            <w:r>
+              <w:rPr>
+                <w:rFonts w:ascii="Calibri" w:hAnsi="Calibri"/>
+                <w:b/>
+                <w:color w:val="FFFFFF"/>
+                <w:sz w:val="16"/>
+              </w:rPr>
+              <w:t>Qualified CPL Ceiling</w:t>
+            </w:r>
+          </w:p>
+        </w:tc>
+      </w:tr>
+      <w:tr>
+        <w:tc>
+          <w:tcPr>
+            <w:tcW w:type="dxa" w:w="2065"/>
+            <w:shd w:fill="FFFFFF"/>
+            <w:tcMar>
+              <w:top w:w="25" w:type="dxa"/>
+              <w:bottom w:w="25" w:type="dxa"/>
+              <w:left w:w="25" w:type="dxa"/>
+              <w:right w:w="25" w:type="dxa"/>
+            </w:tcMar>
+          </w:tcPr>
+          <w:p>
+            <w:r>
+              <w:rPr>
+                <w:rFonts w:ascii="Calibri" w:hAnsi="Calibri"/>
+                <w:color w:val="1E293B"/>
+                <w:sz w:val="16"/>
+              </w:rPr>
+              <w:t>90.0% Pass Rate</w:t>
+            </w:r>
+          </w:p>
+        </w:tc>
+        <w:tc>
+          <w:tcPr>
+            <w:tcW w:type="dxa" w:w="2065"/>
+            <w:shd w:fill="FFFFFF"/>
+            <w:tcMar>
+              <w:top w:w="25" w:type="dxa"/>
+              <w:bottom w:w="25" w:type="dxa"/>
+              <w:left w:w="25" w:type="dxa"/>
+              <w:right w:w="25" w:type="dxa"/>
+            </w:tcMar>
+          </w:tcPr>
+          <w:p>
+            <w:r>
+              <w:rPr>
+                <w:rFonts w:ascii="Calibri" w:hAnsi="Calibri"/>
+                <w:color w:val="1E293B"/>
+                <w:sz w:val="16"/>
+              </w:rPr>
+              <w:t>6,111 Raw Leads</w:t>
+            </w:r>
+          </w:p>
+        </w:tc>
+        <w:tc>
+          <w:tcPr>
+            <w:tcW w:type="dxa" w:w="2065"/>
+            <w:shd w:fill="FFFFFF"/>
+            <w:tcMar>
+              <w:top w:w="25" w:type="dxa"/>
+              <w:bottom w:w="25" w:type="dxa"/>
+              <w:left w:w="25" w:type="dxa"/>
+              <w:right w:w="25" w:type="dxa"/>
+            </w:tcMar>
+          </w:tcPr>
+          <w:p>
+            <w:r>
+              <w:rPr>
+                <w:rFonts w:ascii="Calibri" w:hAnsi="Calibri"/>
+                <w:color w:val="1E293B"/>
+                <w:sz w:val="16"/>
+              </w:rPr>
+              <w:t>5,500 Qualified Leads</w:t>
+            </w:r>
+          </w:p>
+        </w:tc>
+        <w:tc>
+          <w:tcPr>
+            <w:tcW w:type="dxa" w:w="2065"/>
+            <w:shd w:fill="FFFFFF"/>
+            <w:tcMar>
+              <w:top w:w="25" w:type="dxa"/>
+              <w:bottom w:w="25" w:type="dxa"/>
+              <w:left w:w="25" w:type="dxa"/>
+              <w:right w:w="25" w:type="dxa"/>
+            </w:tcMar>
+          </w:tcPr>
+          <w:p>
+            <w:r>
+              <w:rPr>
+                <w:rFonts w:ascii="Calibri" w:hAnsi="Calibri"/>
+                <w:color w:val="1E293B"/>
+                <w:sz w:val="16"/>
+              </w:rPr>
+              <w:t>$26.87 Raw CPL</w:t>
+            </w:r>
+          </w:p>
+        </w:tc>
+        <w:tc>
+          <w:tcPr>
+            <w:tcW w:type="dxa" w:w="2065"/>
+            <w:shd w:fill="FFFFFF"/>
+            <w:tcMar>
+              <w:top w:w="25" w:type="dxa"/>
+              <w:bottom w:w="25" w:type="dxa"/>
+              <w:left w:w="25" w:type="dxa"/>
+              <w:right w:w="25" w:type="dxa"/>
+            </w:tcMar>
+          </w:tcPr>
+          <w:p>
+            <w:r>
+              <w:rPr>
+                <w:rFonts w:ascii="Calibri" w:hAnsi="Calibri"/>
+                <w:color w:val="1E293B"/>
+                <w:sz w:val="16"/>
+              </w:rPr>
+              <w:t>$29.85 Qualified CPL</w:t>
+            </w:r>
+          </w:p>
+        </w:tc>
+      </w:tr>
+      <w:tr>
+        <w:tc>
+          <w:tcPr>
+            <w:tcW w:type="dxa" w:w="2065"/>
+            <w:shd w:fill="EEF2FF"/>
+            <w:tcMar>
+              <w:top w:w="25" w:type="dxa"/>
+              <w:bottom w:w="25" w:type="dxa"/>
+              <w:left w:w="25" w:type="dxa"/>
+              <w:right w:w="25" w:type="dxa"/>
+            </w:tcMar>
+          </w:tcPr>
+          <w:p>
+            <w:r>
+              <w:rPr>
+                <w:rFonts w:ascii="Calibri" w:hAnsi="Calibri"/>
+                <w:b/>
+                <w:color w:val="1E1B4B"/>
+                <w:sz w:val="16"/>
+              </w:rPr>
+              <w:t>80.0% Pass Rate (Base Model)</w:t>
+            </w:r>
+          </w:p>
+        </w:tc>
+        <w:tc>
+          <w:tcPr>
+            <w:tcW w:type="dxa" w:w="2065"/>
+            <w:shd w:fill="EEF2FF"/>
+            <w:tcMar>
+              <w:top w:w="25" w:type="dxa"/>
+              <w:bottom w:w="25" w:type="dxa"/>
+              <w:left w:w="25" w:type="dxa"/>
+              <w:right w:w="25" w:type="dxa"/>
+            </w:tcMar>
+          </w:tcPr>
+          <w:p>
+            <w:r>
+              <w:rPr>
+                <w:rFonts w:ascii="Calibri" w:hAnsi="Calibri"/>
+                <w:b/>
+                <w:color w:val="1E1B4B"/>
+                <w:sz w:val="16"/>
+              </w:rPr>
+              <w:t>6,875 Raw Leads</w:t>
+            </w:r>
+          </w:p>
+        </w:tc>
+        <w:tc>
+          <w:tcPr>
+            <w:tcW w:type="dxa" w:w="2065"/>
+            <w:shd w:fill="EEF2FF"/>
+            <w:tcMar>
+              <w:top w:w="25" w:type="dxa"/>
+              <w:bottom w:w="25" w:type="dxa"/>
+              <w:left w:w="25" w:type="dxa"/>
+              <w:right w:w="25" w:type="dxa"/>
+            </w:tcMar>
+          </w:tcPr>
+          <w:p>
+            <w:r>
+              <w:rPr>
+                <w:rFonts w:ascii="Calibri" w:hAnsi="Calibri"/>
+                <w:b/>
+                <w:color w:val="1E1B4B"/>
+                <w:sz w:val="16"/>
+              </w:rPr>
+              <w:t>5,500 Qualified Leads</w:t>
+            </w:r>
+          </w:p>
+        </w:tc>
+        <w:tc>
+          <w:tcPr>
+            <w:tcW w:type="dxa" w:w="2065"/>
+            <w:shd w:fill="EEF2FF"/>
+            <w:tcMar>
+              <w:top w:w="25" w:type="dxa"/>
+              <w:bottom w:w="25" w:type="dxa"/>
+              <w:left w:w="25" w:type="dxa"/>
+              <w:right w:w="25" w:type="dxa"/>
+            </w:tcMar>
+          </w:tcPr>
+          <w:p>
+            <w:r>
+              <w:rPr>
+                <w:rFonts w:ascii="Calibri" w:hAnsi="Calibri"/>
+                <w:b/>
+                <w:color w:val="1E1B4B"/>
+                <w:sz w:val="16"/>
+              </w:rPr>
+              <w:t>$23.88 Raw CPL</w:t>
+            </w:r>
+          </w:p>
+        </w:tc>
+        <w:tc>
+          <w:tcPr>
+            <w:tcW w:type="dxa" w:w="2065"/>
+            <w:shd w:fill="EEF2FF"/>
+            <w:tcMar>
+              <w:top w:w="25" w:type="dxa"/>
+              <w:bottom w:w="25" w:type="dxa"/>
+              <w:left w:w="25" w:type="dxa"/>
+              <w:right w:w="25" w:type="dxa"/>
+            </w:tcMar>
+          </w:tcPr>
+          <w:p>
+            <w:r>
+              <w:rPr>
+                <w:rFonts w:ascii="Calibri" w:hAnsi="Calibri"/>
+                <w:b/>
+                <w:color w:val="1E1B4B"/>
+                <w:sz w:val="16"/>
+              </w:rPr>
+              <w:t>$29.85 Qualified CPL</w:t>
+            </w:r>
+          </w:p>
+        </w:tc>
+      </w:tr>
+      <w:tr>
+        <w:tc>
+          <w:tcPr>
+            <w:tcW w:type="dxa" w:w="2065"/>
+            <w:shd w:fill="FFFFFF"/>
+            <w:tcMar>
+              <w:top w:w="25" w:type="dxa"/>
+              <w:bottom w:w="25" w:type="dxa"/>
+              <w:left w:w="25" w:type="dxa"/>
+              <w:right w:w="25" w:type="dxa"/>
+            </w:tcMar>
+          </w:tcPr>
+          <w:p>
+            <w:r>
+              <w:rPr>
+                <w:rFonts w:ascii="Calibri" w:hAnsi="Calibri"/>
+                <w:color w:val="1E293B"/>
+                <w:sz w:val="16"/>
+              </w:rPr>
+              <w:t>70.0% Pass Rate</w:t>
+            </w:r>
+          </w:p>
+        </w:tc>
+        <w:tc>
+          <w:tcPr>
+            <w:tcW w:type="dxa" w:w="2065"/>
+            <w:shd w:fill="FFFFFF"/>
+            <w:tcMar>
+              <w:top w:w="25" w:type="dxa"/>
+              <w:bottom w:w="25" w:type="dxa"/>
+              <w:left w:w="25" w:type="dxa"/>
+              <w:right w:w="25" w:type="dxa"/>
+            </w:tcMar>
+          </w:tcPr>
+          <w:p>
+            <w:r>
+              <w:rPr>
+                <w:rFonts w:ascii="Calibri" w:hAnsi="Calibri"/>
+                <w:color w:val="1E293B"/>
+                <w:sz w:val="16"/>
+              </w:rPr>
+              <w:t>7,857 Raw Leads</w:t>
+            </w:r>
+          </w:p>
+        </w:tc>
+        <w:tc>
+          <w:tcPr>
+            <w:tcW w:type="dxa" w:w="2065"/>
+            <w:shd w:fill="FFFFFF"/>
+            <w:tcMar>
+              <w:top w:w="25" w:type="dxa"/>
+              <w:bottom w:w="25" w:type="dxa"/>
+              <w:left w:w="25" w:type="dxa"/>
+              <w:right w:w="25" w:type="dxa"/>
+            </w:tcMar>
+          </w:tcPr>
+          <w:p>
+            <w:r>
+              <w:rPr>
+                <w:rFonts w:ascii="Calibri" w:hAnsi="Calibri"/>
+                <w:color w:val="1E293B"/>
+                <w:sz w:val="16"/>
+              </w:rPr>
+              <w:t>5,500 Qualified Leads</w:t>
+            </w:r>
+          </w:p>
+        </w:tc>
+        <w:tc>
+          <w:tcPr>
+            <w:tcW w:type="dxa" w:w="2065"/>
+            <w:shd w:fill="FFFFFF"/>
+            <w:tcMar>
+              <w:top w:w="25" w:type="dxa"/>
+              <w:bottom w:w="25" w:type="dxa"/>
+              <w:left w:w="25" w:type="dxa"/>
+              <w:right w:w="25" w:type="dxa"/>
+            </w:tcMar>
+          </w:tcPr>
+          <w:p>
+            <w:r>
+              <w:rPr>
+                <w:rFonts w:ascii="Calibri" w:hAnsi="Calibri"/>
+                <w:color w:val="1E293B"/>
+                <w:sz w:val="16"/>
+              </w:rPr>
+              <w:t>$20.90 Raw CPL</w:t>
+            </w:r>
+          </w:p>
+        </w:tc>
+        <w:tc>
+          <w:tcPr>
+            <w:tcW w:type="dxa" w:w="2065"/>
+            <w:shd w:fill="FFFFFF"/>
+            <w:tcMar>
+              <w:top w:w="25" w:type="dxa"/>
+              <w:bottom w:w="25" w:type="dxa"/>
+              <w:left w:w="25" w:type="dxa"/>
+              <w:right w:w="25" w:type="dxa"/>
+            </w:tcMar>
+          </w:tcPr>
+          <w:p>
+            <w:r>
+              <w:rPr>
+                <w:rFonts w:ascii="Calibri" w:hAnsi="Calibri"/>
+                <w:color w:val="1E293B"/>
+                <w:sz w:val="16"/>
+              </w:rPr>
+              <w:t>$29.85 Qualified CPL</w:t>
+            </w:r>
+          </w:p>
+        </w:tc>
+      </w:tr>
+    </w:tbl>
+    <w:p>
+      <w:pPr>
+        <w:spacing w:before="0" w:after="50" w:line="276" w:lineRule="auto"/>
+      </w:pPr>
+      <w:r>
+        <w:rPr>
+          <w:rFonts w:ascii="Calibri" w:hAnsi="Calibri"/>
+          <w:color w:val="1E293B"/>
+          <w:sz w:val="17"/>
+        </w:rPr>
+        <w:t>Industry Benchmarks: Public US education lead CPL on Meta ranges from $22.83 (US average, Superads) to $34.85 (North America high, Focus Digital). Lead forms cost $34.10 vs Instant Experience $49.70. Our required raw CPL of $23.88 at an 80% pass rate aligns with benchmark averages and is the first metric validated during Days 1-3.</w:t>
+      </w:r>
+    </w:p>
+    <w:p>
+      <w:pPr>
+        <w:spacing w:before="180" w:after="60"/>
+      </w:pPr>
+      <w:r>
+        <w:rPr>
+          <w:rFonts w:ascii="Calibri" w:hAnsi="Calibri"/>
+          <w:b/>
+          <w:color w:val="1E1B4B"/>
+          <w:sz w:val="23"/>
+        </w:rPr>
+        <w:t>3. Pillar 1: Compliant Meta Targeting &amp; Mutually Exclusive Geos</w:t>
+      </w:r>
+    </w:p>
+    <w:p>
+      <w:pPr>
+        <w:spacing w:before="100" w:after="40"/>
+      </w:pPr>
+      <w:r>
+        <w:rPr>
+          <w:rFonts w:ascii="Calibri" w:hAnsi="Calibri"/>
+          <w:b/>
+          <w:color w:val="4338CA"/>
+          <w:sz w:val="20"/>
+        </w:rPr>
+        <w:t>Compliant Targeting Mechanisms &amp; Broad Control Arm</w:t>
+      </w:r>
+    </w:p>
+    <w:p>
+      <w:pPr>
+        <w:spacing w:before="0" w:after="50" w:line="276" w:lineRule="auto"/>
+      </w:pPr>
+      <w:r>
+        <w:rPr>
+          <w:rFonts w:ascii="Calibri" w:hAnsi="Calibri"/>
+          <w:color w:val="1E293B"/>
+          <w:sz w:val="17"/>
+        </w:rPr>
+        <w:t>Meta has removed ethnicity and race detailed-targeting options, and ad delivery is increasingly algorithmic. Direct ethnic targeting is non-compliant and legally risky. We reach Indian-American and tech families through 6 compliant operational mechanisms:</w:t>
+      </w:r>
+    </w:p>
+    <w:p>
+      <w:pPr>
+        <w:spacing w:before="0" w:after="50" w:line="276" w:lineRule="auto"/>
+      </w:pPr>
+      <w:r>
+        <w:rPr>
+          <w:rFonts w:ascii="Calibri" w:hAnsi="Calibri"/>
+          <w:color w:val="1E293B"/>
+          <w:sz w:val="17"/>
+        </w:rPr>
+        <w:t>1. Value-Based Lookalikes: Seeded from paying US customers, organically skewing toward the diaspora based on behavioral signals.</w:t>
+        <w:br/>
+        <w:t>2. Zip-Code Geo Clusters: Top school districts (Fremont 94539, Sunnyvale 94087, Frisco 75034, Edison 08820, Bellevue 98052, Alpharetta 30005, Cary 27519).</w:t>
+        <w:br/>
+        <w:t>3. Academic Program Proxies: Parents indexing on Kumon, Russian School of Math (RSM), Mathnasium, Singapore Math, USACO, and FIRST Lego League.</w:t>
+        <w:br/>
+        <w:t>4. Cultural &amp; Academic Creative Cues: Real Python, AI literacy, and college resume building vs passive Roblox gaming.</w:t>
+        <w:br/>
+        <w:t>5. Community Channels: Local temples, cultural associations, and weekend Indian cultural/language schools.</w:t>
+        <w:br/>
+        <w:t>6. Parent Referral Loop: In Round 1, US referral leads converted at 11.9% lead-to-paid vs 9.7% for Meta (directional signal from 101 referral leads).</w:t>
+        <w:br/>
+        <w:t>• Broad / Advantage+ Control Arm: 10-15% of budget allocated without geo/interest constraints to test whether geo tiers beat the algorithm on Cost Per Attended Demo ($62.12 baseline).</w:t>
+      </w:r>
+    </w:p>
+    <w:p>
+      <w:pPr>
+        <w:spacing w:before="100" w:after="40"/>
+      </w:pPr>
+      <w:r>
+        <w:rPr>
+          <w:rFonts w:ascii="Calibri" w:hAnsi="Calibri"/>
+          <w:b/>
+          <w:color w:val="4338CA"/>
+          <w:sz w:val="20"/>
+        </w:rPr>
+        <w:t>Mutually Exclusive 3-Tier Geographic Matrix &amp; Empirical Hypotheses</w:t>
+      </w:r>
+    </w:p>
+    <w:p>
+      <w:pPr>
+        <w:spacing w:before="0" w:after="50" w:line="276" w:lineRule="auto"/>
+      </w:pPr>
+      <w:r>
+        <w:rPr>
+          <w:rFonts w:ascii="Calibri" w:hAnsi="Calibri"/>
+          <w:color w:val="1E293B"/>
+          <w:sz w:val="17"/>
+        </w:rPr>
+        <w:t>Note: Round 1 US data has no zip or income fields and all US rows share one timezone. Tier spreads (close 22/17/13%, ARPU $850/$750/$650) are testable hypotheses:</w:t>
+      </w:r>
+    </w:p>
+    <w:tbl>
+      <w:tblPr>
+        <w:tblW w:type="auto" w:w="0"/>
+        <w:jc w:val="center"/>
+        <w:tblLook w:firstColumn="1" w:firstRow="1" w:lastColumn="0" w:lastRow="0" w:noHBand="0" w:noVBand="1" w:val="04A0"/>
+        <w:tblBorders>
+          <w:top w:val="single" w:sz="4" w:space="0" w:color="CBD5E1"/>
+          <w:bottom w:val="single" w:sz="4" w:space="0" w:color="CBD5E1"/>
+          <w:insideH w:val="single" w:sz="4" w:space="0" w:color="CBD5E1"/>
+          <w:left w:val="none"/>
+          <w:right w:val="none"/>
+          <w:insideV w:val="none"/>
+        </w:tblBorders>
+      </w:tblPr>
+      <w:tblGrid>
+        <w:gridCol w:w="1291"/>
+        <w:gridCol w:w="1291"/>
+        <w:gridCol w:w="1291"/>
+        <w:gridCol w:w="1291"/>
+        <w:gridCol w:w="1291"/>
+        <w:gridCol w:w="1291"/>
+        <w:gridCol w:w="1291"/>
+        <w:gridCol w:w="1291"/>
+      </w:tblGrid>
+      <w:tr>
+        <w:tc>
+          <w:tcPr>
+            <w:tcW w:type="dxa" w:w="1291"/>
+            <w:shd w:fill="1E1B4B"/>
+            <w:tcMar>
+              <w:top w:w="30" w:type="dxa"/>
+              <w:bottom w:w="30" w:type="dxa"/>
+              <w:left w:w="20" w:type="dxa"/>
+              <w:right w:w="20" w:type="dxa"/>
             </w:tcMar>
           </w:tcPr>
           <w:p>
@@ -499,13 +1025,13 @@
         </w:tc>
         <w:tc>
           <w:tcPr>
-            <w:tcW w:type="dxa" w:w="1273"/>
+            <w:tcW w:type="dxa" w:w="1291"/>
             <w:shd w:fill="1E1B4B"/>
             <w:tcMar>
-              <w:top w:w="40" w:type="dxa"/>
-              <w:bottom w:w="40" w:type="dxa"/>
-              <w:left w:w="30" w:type="dxa"/>
-              <w:right w:w="30" w:type="dxa"/>
+              <w:top w:w="30" w:type="dxa"/>
+              <w:bottom w:w="30" w:type="dxa"/>
+              <w:left w:w="20" w:type="dxa"/>
+              <w:right w:w="20" w:type="dxa"/>
             </w:tcMar>
           </w:tcPr>
           <w:p>
@@ -522,13 +1048,13 @@
         </w:tc>
         <w:tc>
           <w:tcPr>
-            <w:tcW w:type="dxa" w:w="1273"/>
+            <w:tcW w:type="dxa" w:w="1291"/>
             <w:shd w:fill="1E1B4B"/>
             <w:tcMar>
-              <w:top w:w="40" w:type="dxa"/>
-              <w:bottom w:w="40" w:type="dxa"/>
-              <w:left w:w="30" w:type="dxa"/>
-              <w:right w:w="30" w:type="dxa"/>
+              <w:top w:w="30" w:type="dxa"/>
+              <w:bottom w:w="30" w:type="dxa"/>
+              <w:left w:w="20" w:type="dxa"/>
+              <w:right w:w="20" w:type="dxa"/>
             </w:tcMar>
           </w:tcPr>
           <w:p>
@@ -545,13 +1071,13 @@
         </w:tc>
         <w:tc>
           <w:tcPr>
-            <w:tcW w:type="dxa" w:w="1273"/>
+            <w:tcW w:type="dxa" w:w="1291"/>
             <w:shd w:fill="1E1B4B"/>
             <w:tcMar>
-              <w:top w:w="40" w:type="dxa"/>
-              <w:bottom w:w="40" w:type="dxa"/>
-              <w:left w:w="30" w:type="dxa"/>
-              <w:right w:w="30" w:type="dxa"/>
+              <w:top w:w="30" w:type="dxa"/>
+              <w:bottom w:w="30" w:type="dxa"/>
+              <w:left w:w="20" w:type="dxa"/>
+              <w:right w:w="20" w:type="dxa"/>
             </w:tcMar>
           </w:tcPr>
           <w:p>
@@ -568,13 +1094,13 @@
         </w:tc>
         <w:tc>
           <w:tcPr>
-            <w:tcW w:type="dxa" w:w="1273"/>
+            <w:tcW w:type="dxa" w:w="1291"/>
             <w:shd w:fill="1E1B4B"/>
             <w:tcMar>
-              <w:top w:w="40" w:type="dxa"/>
-              <w:bottom w:w="40" w:type="dxa"/>
-              <w:left w:w="30" w:type="dxa"/>
-              <w:right w:w="30" w:type="dxa"/>
+              <w:top w:w="30" w:type="dxa"/>
+              <w:bottom w:w="30" w:type="dxa"/>
+              <w:left w:w="20" w:type="dxa"/>
+              <w:right w:w="20" w:type="dxa"/>
             </w:tcMar>
           </w:tcPr>
           <w:p>
@@ -591,13 +1117,13 @@
         </w:tc>
         <w:tc>
           <w:tcPr>
-            <w:tcW w:type="dxa" w:w="1273"/>
+            <w:tcW w:type="dxa" w:w="1291"/>
             <w:shd w:fill="1E1B4B"/>
             <w:tcMar>
-              <w:top w:w="40" w:type="dxa"/>
-              <w:bottom w:w="40" w:type="dxa"/>
-              <w:left w:w="30" w:type="dxa"/>
-              <w:right w:w="30" w:type="dxa"/>
+              <w:top w:w="30" w:type="dxa"/>
+              <w:bottom w:w="30" w:type="dxa"/>
+              <w:left w:w="20" w:type="dxa"/>
+              <w:right w:w="20" w:type="dxa"/>
             </w:tcMar>
           </w:tcPr>
           <w:p>
@@ -614,13 +1140,13 @@
         </w:tc>
         <w:tc>
           <w:tcPr>
-            <w:tcW w:type="dxa" w:w="1273"/>
+            <w:tcW w:type="dxa" w:w="1291"/>
             <w:shd w:fill="1E1B4B"/>
             <w:tcMar>
-              <w:top w:w="40" w:type="dxa"/>
-              <w:bottom w:w="40" w:type="dxa"/>
-              <w:left w:w="30" w:type="dxa"/>
-              <w:right w:w="30" w:type="dxa"/>
+              <w:top w:w="30" w:type="dxa"/>
+              <w:bottom w:w="30" w:type="dxa"/>
+              <w:left w:w="20" w:type="dxa"/>
+              <w:right w:w="20" w:type="dxa"/>
             </w:tcMar>
           </w:tcPr>
           <w:p>
@@ -637,13 +1163,13 @@
         </w:tc>
         <w:tc>
           <w:tcPr>
-            <w:tcW w:type="dxa" w:w="1273"/>
+            <w:tcW w:type="dxa" w:w="1291"/>
             <w:shd w:fill="1E1B4B"/>
             <w:tcMar>
-              <w:top w:w="40" w:type="dxa"/>
-              <w:bottom w:w="40" w:type="dxa"/>
-              <w:left w:w="30" w:type="dxa"/>
-              <w:right w:w="30" w:type="dxa"/>
+              <w:top w:w="30" w:type="dxa"/>
+              <w:bottom w:w="30" w:type="dxa"/>
+              <w:left w:w="20" w:type="dxa"/>
+              <w:right w:w="20" w:type="dxa"/>
             </w:tcMar>
           </w:tcPr>
           <w:p>
@@ -662,13 +1188,13 @@
       <w:tr>
         <w:tc>
           <w:tcPr>
-            <w:tcW w:type="dxa" w:w="1273"/>
+            <w:tcW w:type="dxa" w:w="1291"/>
             <w:shd w:fill="F8FAFC"/>
             <w:tcMar>
-              <w:top w:w="30" w:type="dxa"/>
-              <w:bottom w:w="30" w:type="dxa"/>
-              <w:left w:w="30" w:type="dxa"/>
-              <w:right w:w="30" w:type="dxa"/>
+              <w:top w:w="25" w:type="dxa"/>
+              <w:bottom w:w="25" w:type="dxa"/>
+              <w:left w:w="20" w:type="dxa"/>
+              <w:right w:w="20" w:type="dxa"/>
             </w:tcMar>
           </w:tcPr>
           <w:p>
@@ -684,13 +1210,13 @@
         </w:tc>
         <w:tc>
           <w:tcPr>
-            <w:tcW w:type="dxa" w:w="1273"/>
+            <w:tcW w:type="dxa" w:w="1291"/>
             <w:shd w:fill="F8FAFC"/>
             <w:tcMar>
-              <w:top w:w="30" w:type="dxa"/>
-              <w:bottom w:w="30" w:type="dxa"/>
-              <w:left w:w="30" w:type="dxa"/>
-              <w:right w:w="30" w:type="dxa"/>
+              <w:top w:w="25" w:type="dxa"/>
+              <w:bottom w:w="25" w:type="dxa"/>
+              <w:left w:w="20" w:type="dxa"/>
+              <w:right w:w="20" w:type="dxa"/>
             </w:tcMar>
           </w:tcPr>
           <w:p>
@@ -706,13 +1232,13 @@
         </w:tc>
         <w:tc>
           <w:tcPr>
-            <w:tcW w:type="dxa" w:w="1273"/>
+            <w:tcW w:type="dxa" w:w="1291"/>
             <w:shd w:fill="F8FAFC"/>
             <w:tcMar>
-              <w:top w:w="30" w:type="dxa"/>
-              <w:bottom w:w="30" w:type="dxa"/>
-              <w:left w:w="30" w:type="dxa"/>
-              <w:right w:w="30" w:type="dxa"/>
+              <w:top w:w="25" w:type="dxa"/>
+              <w:bottom w:w="25" w:type="dxa"/>
+              <w:left w:w="20" w:type="dxa"/>
+              <w:right w:w="20" w:type="dxa"/>
             </w:tcMar>
           </w:tcPr>
           <w:p>
@@ -728,13 +1254,13 @@
         </w:tc>
         <w:tc>
           <w:tcPr>
-            <w:tcW w:type="dxa" w:w="1273"/>
+            <w:tcW w:type="dxa" w:w="1291"/>
             <w:shd w:fill="F8FAFC"/>
             <w:tcMar>
-              <w:top w:w="30" w:type="dxa"/>
-              <w:bottom w:w="30" w:type="dxa"/>
-              <w:left w:w="30" w:type="dxa"/>
-              <w:right w:w="30" w:type="dxa"/>
+              <w:top w:w="25" w:type="dxa"/>
+              <w:bottom w:w="25" w:type="dxa"/>
+              <w:left w:w="20" w:type="dxa"/>
+              <w:right w:w="20" w:type="dxa"/>
             </w:tcMar>
           </w:tcPr>
           <w:p>
@@ -750,13 +1276,13 @@
         </w:tc>
         <w:tc>
           <w:tcPr>
-            <w:tcW w:type="dxa" w:w="1273"/>
+            <w:tcW w:type="dxa" w:w="1291"/>
             <w:shd w:fill="F8FAFC"/>
             <w:tcMar>
-              <w:top w:w="30" w:type="dxa"/>
-              <w:bottom w:w="30" w:type="dxa"/>
-              <w:left w:w="30" w:type="dxa"/>
-              <w:right w:w="30" w:type="dxa"/>
+              <w:top w:w="25" w:type="dxa"/>
+              <w:bottom w:w="25" w:type="dxa"/>
+              <w:left w:w="20" w:type="dxa"/>
+              <w:right w:w="20" w:type="dxa"/>
             </w:tcMar>
           </w:tcPr>
           <w:p>
@@ -772,13 +1298,13 @@
         </w:tc>
         <w:tc>
           <w:tcPr>
-            <w:tcW w:type="dxa" w:w="1273"/>
+            <w:tcW w:type="dxa" w:w="1291"/>
             <w:shd w:fill="F8FAFC"/>
             <w:tcMar>
-              <w:top w:w="30" w:type="dxa"/>
-              <w:bottom w:w="30" w:type="dxa"/>
-              <w:left w:w="30" w:type="dxa"/>
-              <w:right w:w="30" w:type="dxa"/>
+              <w:top w:w="25" w:type="dxa"/>
+              <w:bottom w:w="25" w:type="dxa"/>
+              <w:left w:w="20" w:type="dxa"/>
+              <w:right w:w="20" w:type="dxa"/>
             </w:tcMar>
           </w:tcPr>
           <w:p>
@@ -794,13 +1320,13 @@
         </w:tc>
         <w:tc>
           <w:tcPr>
-            <w:tcW w:type="dxa" w:w="1273"/>
+            <w:tcW w:type="dxa" w:w="1291"/>
             <w:shd w:fill="F8FAFC"/>
             <w:tcMar>
-              <w:top w:w="30" w:type="dxa"/>
-              <w:bottom w:w="30" w:type="dxa"/>
-              <w:left w:w="30" w:type="dxa"/>
-              <w:right w:w="30" w:type="dxa"/>
+              <w:top w:w="25" w:type="dxa"/>
+              <w:bottom w:w="25" w:type="dxa"/>
+              <w:left w:w="20" w:type="dxa"/>
+              <w:right w:w="20" w:type="dxa"/>
             </w:tcMar>
           </w:tcPr>
           <w:p>
@@ -816,13 +1342,13 @@
         </w:tc>
         <w:tc>
           <w:tcPr>
-            <w:tcW w:type="dxa" w:w="1273"/>
+            <w:tcW w:type="dxa" w:w="1291"/>
             <w:shd w:fill="F8FAFC"/>
             <w:tcMar>
-              <w:top w:w="30" w:type="dxa"/>
-              <w:bottom w:w="30" w:type="dxa"/>
-              <w:left w:w="30" w:type="dxa"/>
-              <w:right w:w="30" w:type="dxa"/>
+              <w:top w:w="25" w:type="dxa"/>
+              <w:bottom w:w="25" w:type="dxa"/>
+              <w:left w:w="20" w:type="dxa"/>
+              <w:right w:w="20" w:type="dxa"/>
             </w:tcMar>
           </w:tcPr>
           <w:p>
@@ -840,13 +1366,13 @@
       <w:tr>
         <w:tc>
           <w:tcPr>
-            <w:tcW w:type="dxa" w:w="1273"/>
+            <w:tcW w:type="dxa" w:w="1291"/>
             <w:shd w:fill="FFFFFF"/>
             <w:tcMar>
-              <w:top w:w="30" w:type="dxa"/>
-              <w:bottom w:w="30" w:type="dxa"/>
-              <w:left w:w="30" w:type="dxa"/>
-              <w:right w:w="30" w:type="dxa"/>
+              <w:top w:w="25" w:type="dxa"/>
+              <w:bottom w:w="25" w:type="dxa"/>
+              <w:left w:w="20" w:type="dxa"/>
+              <w:right w:w="20" w:type="dxa"/>
             </w:tcMar>
           </w:tcPr>
           <w:p>
@@ -862,13 +1388,13 @@
         </w:tc>
         <w:tc>
           <w:tcPr>
-            <w:tcW w:type="dxa" w:w="1273"/>
+            <w:tcW w:type="dxa" w:w="1291"/>
             <w:shd w:fill="FFFFFF"/>
             <w:tcMar>
-              <w:top w:w="30" w:type="dxa"/>
-              <w:bottom w:w="30" w:type="dxa"/>
-              <w:left w:w="30" w:type="dxa"/>
-              <w:right w:w="30" w:type="dxa"/>
+              <w:top w:w="25" w:type="dxa"/>
+              <w:bottom w:w="25" w:type="dxa"/>
+              <w:left w:w="20" w:type="dxa"/>
+              <w:right w:w="20" w:type="dxa"/>
             </w:tcMar>
           </w:tcPr>
           <w:p>
@@ -884,13 +1410,13 @@
         </w:tc>
         <w:tc>
           <w:tcPr>
-            <w:tcW w:type="dxa" w:w="1273"/>
+            <w:tcW w:type="dxa" w:w="1291"/>
             <w:shd w:fill="FFFFFF"/>
             <w:tcMar>
-              <w:top w:w="30" w:type="dxa"/>
-              <w:bottom w:w="30" w:type="dxa"/>
-              <w:left w:w="30" w:type="dxa"/>
-              <w:right w:w="30" w:type="dxa"/>
+              <w:top w:w="25" w:type="dxa"/>
+              <w:bottom w:w="25" w:type="dxa"/>
+              <w:left w:w="20" w:type="dxa"/>
+              <w:right w:w="20" w:type="dxa"/>
             </w:tcMar>
           </w:tcPr>
           <w:p>
@@ -906,13 +1432,13 @@
         </w:tc>
         <w:tc>
           <w:tcPr>
-            <w:tcW w:type="dxa" w:w="1273"/>
+            <w:tcW w:type="dxa" w:w="1291"/>
             <w:shd w:fill="FFFFFF"/>
             <w:tcMar>
-              <w:top w:w="30" w:type="dxa"/>
-              <w:bottom w:w="30" w:type="dxa"/>
-              <w:left w:w="30" w:type="dxa"/>
-              <w:right w:w="30" w:type="dxa"/>
+              <w:top w:w="25" w:type="dxa"/>
+              <w:bottom w:w="25" w:type="dxa"/>
+              <w:left w:w="20" w:type="dxa"/>
+              <w:right w:w="20" w:type="dxa"/>
             </w:tcMar>
           </w:tcPr>
           <w:p>
@@ -928,13 +1454,13 @@
         </w:tc>
         <w:tc>
           <w:tcPr>
-            <w:tcW w:type="dxa" w:w="1273"/>
+            <w:tcW w:type="dxa" w:w="1291"/>
             <w:shd w:fill="FFFFFF"/>
             <w:tcMar>
-              <w:top w:w="30" w:type="dxa"/>
-              <w:bottom w:w="30" w:type="dxa"/>
-              <w:left w:w="30" w:type="dxa"/>
-              <w:right w:w="30" w:type="dxa"/>
+              <w:top w:w="25" w:type="dxa"/>
+              <w:bottom w:w="25" w:type="dxa"/>
+              <w:left w:w="20" w:type="dxa"/>
+              <w:right w:w="20" w:type="dxa"/>
             </w:tcMar>
           </w:tcPr>
           <w:p>
@@ -950,13 +1476,13 @@
         </w:tc>
         <w:tc>
           <w:tcPr>
-            <w:tcW w:type="dxa" w:w="1273"/>
+            <w:tcW w:type="dxa" w:w="1291"/>
             <w:shd w:fill="FFFFFF"/>
             <w:tcMar>
-              <w:top w:w="30" w:type="dxa"/>
-              <w:bottom w:w="30" w:type="dxa"/>
-              <w:left w:w="30" w:type="dxa"/>
-              <w:right w:w="30" w:type="dxa"/>
+              <w:top w:w="25" w:type="dxa"/>
+              <w:bottom w:w="25" w:type="dxa"/>
+              <w:left w:w="20" w:type="dxa"/>
+              <w:right w:w="20" w:type="dxa"/>
             </w:tcMar>
           </w:tcPr>
           <w:p>
@@ -972,13 +1498,13 @@
         </w:tc>
         <w:tc>
           <w:tcPr>
-            <w:tcW w:type="dxa" w:w="1273"/>
+            <w:tcW w:type="dxa" w:w="1291"/>
             <w:shd w:fill="FFFFFF"/>
             <w:tcMar>
-              <w:top w:w="30" w:type="dxa"/>
-              <w:bottom w:w="30" w:type="dxa"/>
-              <w:left w:w="30" w:type="dxa"/>
-              <w:right w:w="30" w:type="dxa"/>
+              <w:top w:w="25" w:type="dxa"/>
+              <w:bottom w:w="25" w:type="dxa"/>
+              <w:left w:w="20" w:type="dxa"/>
+              <w:right w:w="20" w:type="dxa"/>
             </w:tcMar>
           </w:tcPr>
           <w:p>
@@ -994,13 +1520,13 @@
         </w:tc>
         <w:tc>
           <w:tcPr>
-            <w:tcW w:type="dxa" w:w="1273"/>
+            <w:tcW w:type="dxa" w:w="1291"/>
             <w:shd w:fill="FFFFFF"/>
             <w:tcMar>
-              <w:top w:w="30" w:type="dxa"/>
-              <w:bottom w:w="30" w:type="dxa"/>
-              <w:left w:w="30" w:type="dxa"/>
-              <w:right w:w="30" w:type="dxa"/>
+              <w:top w:w="25" w:type="dxa"/>
+              <w:bottom w:w="25" w:type="dxa"/>
+              <w:left w:w="20" w:type="dxa"/>
+              <w:right w:w="20" w:type="dxa"/>
             </w:tcMar>
           </w:tcPr>
           <w:p>
@@ -1018,13 +1544,13 @@
       <w:tr>
         <w:tc>
           <w:tcPr>
-            <w:tcW w:type="dxa" w:w="1273"/>
+            <w:tcW w:type="dxa" w:w="1291"/>
             <w:shd w:fill="F8FAFC"/>
             <w:tcMar>
-              <w:top w:w="30" w:type="dxa"/>
-              <w:bottom w:w="30" w:type="dxa"/>
-              <w:left w:w="30" w:type="dxa"/>
-              <w:right w:w="30" w:type="dxa"/>
+              <w:top w:w="25" w:type="dxa"/>
+              <w:bottom w:w="25" w:type="dxa"/>
+              <w:left w:w="20" w:type="dxa"/>
+              <w:right w:w="20" w:type="dxa"/>
             </w:tcMar>
           </w:tcPr>
           <w:p>
@@ -1040,13 +1566,13 @@
         </w:tc>
         <w:tc>
           <w:tcPr>
-            <w:tcW w:type="dxa" w:w="1273"/>
+            <w:tcW w:type="dxa" w:w="1291"/>
             <w:shd w:fill="F8FAFC"/>
             <w:tcMar>
-              <w:top w:w="30" w:type="dxa"/>
-              <w:bottom w:w="30" w:type="dxa"/>
-              <w:left w:w="30" w:type="dxa"/>
-              <w:right w:w="30" w:type="dxa"/>
+              <w:top w:w="25" w:type="dxa"/>
+              <w:bottom w:w="25" w:type="dxa"/>
+              <w:left w:w="20" w:type="dxa"/>
+              <w:right w:w="20" w:type="dxa"/>
             </w:tcMar>
           </w:tcPr>
           <w:p>
@@ -1062,13 +1588,13 @@
         </w:tc>
         <w:tc>
           <w:tcPr>
-            <w:tcW w:type="dxa" w:w="1273"/>
+            <w:tcW w:type="dxa" w:w="1291"/>
             <w:shd w:fill="F8FAFC"/>
             <w:tcMar>
-              <w:top w:w="30" w:type="dxa"/>
-              <w:bottom w:w="30" w:type="dxa"/>
-              <w:left w:w="30" w:type="dxa"/>
-              <w:right w:w="30" w:type="dxa"/>
+              <w:top w:w="25" w:type="dxa"/>
+              <w:bottom w:w="25" w:type="dxa"/>
+              <w:left w:w="20" w:type="dxa"/>
+              <w:right w:w="20" w:type="dxa"/>
             </w:tcMar>
           </w:tcPr>
           <w:p>
@@ -1084,13 +1610,13 @@
         </w:tc>
         <w:tc>
           <w:tcPr>
-            <w:tcW w:type="dxa" w:w="1273"/>
+            <w:tcW w:type="dxa" w:w="1291"/>
             <w:shd w:fill="F8FAFC"/>
             <w:tcMar>
-              <w:top w:w="30" w:type="dxa"/>
-              <w:bottom w:w="30" w:type="dxa"/>
-              <w:left w:w="30" w:type="dxa"/>
-              <w:right w:w="30" w:type="dxa"/>
+              <w:top w:w="25" w:type="dxa"/>
+              <w:bottom w:w="25" w:type="dxa"/>
+              <w:left w:w="20" w:type="dxa"/>
+              <w:right w:w="20" w:type="dxa"/>
             </w:tcMar>
           </w:tcPr>
           <w:p>
@@ -1106,13 +1632,13 @@
         </w:tc>
         <w:tc>
           <w:tcPr>
-            <w:tcW w:type="dxa" w:w="1273"/>
+            <w:tcW w:type="dxa" w:w="1291"/>
             <w:shd w:fill="F8FAFC"/>
             <w:tcMar>
-              <w:top w:w="30" w:type="dxa"/>
-              <w:bottom w:w="30" w:type="dxa"/>
-              <w:left w:w="30" w:type="dxa"/>
-              <w:right w:w="30" w:type="dxa"/>
+              <w:top w:w="25" w:type="dxa"/>
+              <w:bottom w:w="25" w:type="dxa"/>
+              <w:left w:w="20" w:type="dxa"/>
+              <w:right w:w="20" w:type="dxa"/>
             </w:tcMar>
           </w:tcPr>
           <w:p>
@@ -1128,13 +1654,13 @@
         </w:tc>
         <w:tc>
           <w:tcPr>
-            <w:tcW w:type="dxa" w:w="1273"/>
+            <w:tcW w:type="dxa" w:w="1291"/>
             <w:shd w:fill="F8FAFC"/>
             <w:tcMar>
-              <w:top w:w="30" w:type="dxa"/>
-              <w:bottom w:w="30" w:type="dxa"/>
-              <w:left w:w="30" w:type="dxa"/>
-              <w:right w:w="30" w:type="dxa"/>
+              <w:top w:w="25" w:type="dxa"/>
+              <w:bottom w:w="25" w:type="dxa"/>
+              <w:left w:w="20" w:type="dxa"/>
+              <w:right w:w="20" w:type="dxa"/>
             </w:tcMar>
           </w:tcPr>
           <w:p>
@@ -1150,13 +1676,13 @@
         </w:tc>
         <w:tc>
           <w:tcPr>
-            <w:tcW w:type="dxa" w:w="1273"/>
+            <w:tcW w:type="dxa" w:w="1291"/>
             <w:shd w:fill="F8FAFC"/>
             <w:tcMar>
-              <w:top w:w="30" w:type="dxa"/>
-              <w:bottom w:w="30" w:type="dxa"/>
-              <w:left w:w="30" w:type="dxa"/>
-              <w:right w:w="30" w:type="dxa"/>
+              <w:top w:w="25" w:type="dxa"/>
+              <w:bottom w:w="25" w:type="dxa"/>
+              <w:left w:w="20" w:type="dxa"/>
+              <w:right w:w="20" w:type="dxa"/>
             </w:tcMar>
           </w:tcPr>
           <w:p>
@@ -1172,13 +1698,13 @@
         </w:tc>
         <w:tc>
           <w:tcPr>
-            <w:tcW w:type="dxa" w:w="1273"/>
+            <w:tcW w:type="dxa" w:w="1291"/>
             <w:shd w:fill="F8FAFC"/>
             <w:tcMar>
-              <w:top w:w="30" w:type="dxa"/>
-              <w:bottom w:w="30" w:type="dxa"/>
-              <w:left w:w="30" w:type="dxa"/>
-              <w:right w:w="30" w:type="dxa"/>
+              <w:top w:w="25" w:type="dxa"/>
+              <w:bottom w:w="25" w:type="dxa"/>
+              <w:left w:w="20" w:type="dxa"/>
+              <w:right w:w="20" w:type="dxa"/>
             </w:tcMar>
           </w:tcPr>
           <w:p>
@@ -1196,13 +1722,13 @@
       <w:tr>
         <w:tc>
           <w:tcPr>
-            <w:tcW w:type="dxa" w:w="1273"/>
+            <w:tcW w:type="dxa" w:w="1291"/>
             <w:shd w:fill="EEF2FF"/>
             <w:tcMar>
-              <w:top w:w="30" w:type="dxa"/>
-              <w:bottom w:w="30" w:type="dxa"/>
-              <w:left w:w="30" w:type="dxa"/>
-              <w:right w:w="30" w:type="dxa"/>
+              <w:top w:w="25" w:type="dxa"/>
+              <w:bottom w:w="25" w:type="dxa"/>
+              <w:left w:w="20" w:type="dxa"/>
+              <w:right w:w="20" w:type="dxa"/>
             </w:tcMar>
           </w:tcPr>
           <w:p>
@@ -1219,13 +1745,13 @@
         </w:tc>
         <w:tc>
           <w:tcPr>
-            <w:tcW w:type="dxa" w:w="1273"/>
+            <w:tcW w:type="dxa" w:w="1291"/>
             <w:shd w:fill="EEF2FF"/>
             <w:tcMar>
-              <w:top w:w="30" w:type="dxa"/>
-              <w:bottom w:w="30" w:type="dxa"/>
-              <w:left w:w="30" w:type="dxa"/>
-              <w:right w:w="30" w:type="dxa"/>
+              <w:top w:w="25" w:type="dxa"/>
+              <w:bottom w:w="25" w:type="dxa"/>
+              <w:left w:w="20" w:type="dxa"/>
+              <w:right w:w="20" w:type="dxa"/>
             </w:tcMar>
           </w:tcPr>
           <w:p>
@@ -1242,13 +1768,13 @@
         </w:tc>
         <w:tc>
           <w:tcPr>
-            <w:tcW w:type="dxa" w:w="1273"/>
+            <w:tcW w:type="dxa" w:w="1291"/>
             <w:shd w:fill="EEF2FF"/>
             <w:tcMar>
-              <w:top w:w="30" w:type="dxa"/>
-              <w:bottom w:w="30" w:type="dxa"/>
-              <w:left w:w="30" w:type="dxa"/>
-              <w:right w:w="30" w:type="dxa"/>
+              <w:top w:w="25" w:type="dxa"/>
+              <w:bottom w:w="25" w:type="dxa"/>
+              <w:left w:w="20" w:type="dxa"/>
+              <w:right w:w="20" w:type="dxa"/>
             </w:tcMar>
           </w:tcPr>
           <w:p>
@@ -1265,13 +1791,13 @@
         </w:tc>
         <w:tc>
           <w:tcPr>
-            <w:tcW w:type="dxa" w:w="1273"/>
+            <w:tcW w:type="dxa" w:w="1291"/>
             <w:shd w:fill="EEF2FF"/>
             <w:tcMar>
-              <w:top w:w="30" w:type="dxa"/>
-              <w:bottom w:w="30" w:type="dxa"/>
-              <w:left w:w="30" w:type="dxa"/>
-              <w:right w:w="30" w:type="dxa"/>
+              <w:top w:w="25" w:type="dxa"/>
+              <w:bottom w:w="25" w:type="dxa"/>
+              <w:left w:w="20" w:type="dxa"/>
+              <w:right w:w="20" w:type="dxa"/>
             </w:tcMar>
           </w:tcPr>
           <w:p>
@@ -1288,13 +1814,13 @@
         </w:tc>
         <w:tc>
           <w:tcPr>
-            <w:tcW w:type="dxa" w:w="1273"/>
+            <w:tcW w:type="dxa" w:w="1291"/>
             <w:shd w:fill="EEF2FF"/>
             <w:tcMar>
-              <w:top w:w="30" w:type="dxa"/>
-              <w:bottom w:w="30" w:type="dxa"/>
-              <w:left w:w="30" w:type="dxa"/>
-              <w:right w:w="30" w:type="dxa"/>
+              <w:top w:w="25" w:type="dxa"/>
+              <w:bottom w:w="25" w:type="dxa"/>
+              <w:left w:w="20" w:type="dxa"/>
+              <w:right w:w="20" w:type="dxa"/>
             </w:tcMar>
           </w:tcPr>
           <w:p>
@@ -1311,13 +1837,13 @@
         </w:tc>
         <w:tc>
           <w:tcPr>
-            <w:tcW w:type="dxa" w:w="1273"/>
+            <w:tcW w:type="dxa" w:w="1291"/>
             <w:shd w:fill="EEF2FF"/>
             <w:tcMar>
-              <w:top w:w="30" w:type="dxa"/>
-              <w:bottom w:w="30" w:type="dxa"/>
-              <w:left w:w="30" w:type="dxa"/>
-              <w:right w:w="30" w:type="dxa"/>
+              <w:top w:w="25" w:type="dxa"/>
+              <w:bottom w:w="25" w:type="dxa"/>
+              <w:left w:w="20" w:type="dxa"/>
+              <w:right w:w="20" w:type="dxa"/>
             </w:tcMar>
           </w:tcPr>
           <w:p>
@@ -1334,13 +1860,13 @@
         </w:tc>
         <w:tc>
           <w:tcPr>
-            <w:tcW w:type="dxa" w:w="1273"/>
+            <w:tcW w:type="dxa" w:w="1291"/>
             <w:shd w:fill="EEF2FF"/>
             <w:tcMar>
-              <w:top w:w="30" w:type="dxa"/>
-              <w:bottom w:w="30" w:type="dxa"/>
-              <w:left w:w="30" w:type="dxa"/>
-              <w:right w:w="30" w:type="dxa"/>
+              <w:top w:w="25" w:type="dxa"/>
+              <w:bottom w:w="25" w:type="dxa"/>
+              <w:left w:w="20" w:type="dxa"/>
+              <w:right w:w="20" w:type="dxa"/>
             </w:tcMar>
           </w:tcPr>
           <w:p>
@@ -1357,13 +1883,13 @@
         </w:tc>
         <w:tc>
           <w:tcPr>
-            <w:tcW w:type="dxa" w:w="1273"/>
+            <w:tcW w:type="dxa" w:w="1291"/>
             <w:shd w:fill="EEF2FF"/>
             <w:tcMar>
-              <w:top w:w="30" w:type="dxa"/>
-              <w:bottom w:w="30" w:type="dxa"/>
-              <w:left w:w="30" w:type="dxa"/>
-              <w:right w:w="30" w:type="dxa"/>
+              <w:top w:w="25" w:type="dxa"/>
+              <w:bottom w:w="25" w:type="dxa"/>
+              <w:left w:w="20" w:type="dxa"/>
+              <w:right w:w="20" w:type="dxa"/>
             </w:tcMar>
           </w:tcPr>
           <w:p>
@@ -1382,978 +1908,136 @@
     </w:tbl>
     <w:p>
       <w:pPr>
-        <w:spacing w:after="80"/>
+        <w:spacing w:before="0" w:after="50" w:line="276" w:lineRule="auto"/>
       </w:pPr>
+      <w:r>
+        <w:rPr>
+          <w:rFonts w:ascii="Calibri" w:hAnsi="Calibri"/>
+          <w:color w:val="1E293B"/>
+          <w:sz w:val="17"/>
+        </w:rPr>
+        <w:t>Q4 Seasonality &amp; Pacing: November (2,500 leads @ $30.80 CPL = $77k) incorporates higher CPMs and a 50% spend pause Nov 24-27 (Thanksgiving). December (3,000 leads @ $29.06 CPL = $87,175) captures STEM holiday gifting and New Year 2027 headstart intent. CPL contingency rule: if weekly blended CPL &gt; $33, shift budget to Tier 2/3 and referral loop before cutting volume.</w:t>
+      </w:r>
     </w:p>
     <w:p>
       <w:pPr>
-        <w:spacing w:before="200" w:after="60"/>
+        <w:spacing w:before="180" w:after="60"/>
       </w:pPr>
       <w:r>
         <w:rPr>
           <w:rFonts w:ascii="Calibri" w:hAnsi="Calibri"/>
           <w:b/>
           <w:color w:val="1E1B4B"/>
-          <w:sz w:val="24"/>
+          <w:sz w:val="23"/>
         </w:rPr>
-        <w:t>3. Pillar 2: Product-Tech Data Pipeline &amp; Intake Funnel</w:t>
+        <w:t>4. Pillar 2: Product-Tech Data Pipeline &amp; Intake Funnel</w:t>
       </w:r>
     </w:p>
     <w:p>
       <w:pPr>
-        <w:spacing w:before="120" w:after="40"/>
+        <w:spacing w:before="100" w:after="40"/>
       </w:pPr>
       <w:r>
         <w:rPr>
           <w:rFonts w:ascii="Calibri" w:hAnsi="Calibri"/>
           <w:b/>
           <w:color w:val="4338CA"/>
-          <w:sz w:val="21"/>
+          <w:sz w:val="20"/>
         </w:rPr>
-        <w:t>Server-Side Meta CAPI: Monotonic Expected Values P(Paid | Stage) x ARPU</w:t>
+        <w:t>Server-Side Meta CAPI (Graph API v21.0) &amp; Monotonic Expected Values</w:t>
       </w:r>
     </w:p>
     <w:p>
       <w:pPr>
-        <w:spacing w:before="0" w:after="60" w:line="276" w:lineRule="auto"/>
+        <w:spacing w:before="0" w:after="50" w:line="276" w:lineRule="auto"/>
       </w:pPr>
       <w:r>
         <w:rPr>
           <w:rFonts w:ascii="Calibri" w:hAnsi="Calibri"/>
           <w:color w:val="1E293B"/>
-          <w:sz w:val="18"/>
+          <w:sz w:val="17"/>
         </w:rPr>
-        <w:t>To overcome iOS 14.5+ pixel loss and train Meta on paying parents, our backend dispatcher (meta_capi_dispatcher.py) calculates monotonic values where downstream expected revenue strictly ascends:</w:t>
+        <w:t>Dispatched via real-time webhooks (Meta rejects requests if event_time &gt; 7 days old; no batch backlogs):</w:t>
       </w:r>
     </w:p>
     <w:p>
       <w:pPr>
-        <w:spacing w:before="0" w:after="60" w:line="276" w:lineRule="auto"/>
+        <w:spacing w:before="0" w:after="50" w:line="276" w:lineRule="auto"/>
       </w:pPr>
       <w:r>
         <w:rPr>
           <w:rFonts w:ascii="Calibri" w:hAnsi="Calibri"/>
           <w:color w:val="1E293B"/>
-          <w:sz w:val="18"/>
+          <w:sz w:val="17"/>
         </w:rPr>
-        <w:t>• Tier 1 Values: Lead: $102.33 -&gt; Schedule: $142.12 -&gt; DemoAttended: $187.00 -&gt; Purchase: $850.00</w:t>
+        <w:t>• Expected Value Formula: Value(Stage) = P(Paid | Stage) x Net ARPU (strictly monotonic: Lead $66.83 &lt; Schedule $98.72 &lt; DemoAttended $139.07 &lt; Purchase $777.06).</w:t>
         <w:br/>
-        <w:t>• Tier 2 Values: Lead: $61.56 -&gt; Schedule: $90.53 -&gt; DemoAttended: $127.50 -&gt; Purchase: $750.00</w:t>
+        <w:t>• Campaign Optimization Config: Optimized strictly on 'Schedule' (~3,723 events or ~108/week/ad-set, stably exiting Meta's 50 conversions/week learning phase). 'Purchase' (473 events) and 'DemoAttended' stream as offline Value Signals for Target ROAS / Value-Based Bidding (VBB).</w:t>
         <w:br/>
-        <w:t>• Tier 3 Values: Lead: $33.53 -&gt; Schedule: $54.08 -&gt; DemoAttended: $84.50 -&gt; Purchase: $650.00</w:t>
-        <w:br/>
-        <w:t>• Blended Defaults: Lead: $66.83 -&gt; Schedule: $98.72 -&gt; DemoAttended: $139.07 -&gt; Purchase: $777.06</w:t>
-        <w:br/>
-        <w:t>• Primary Optimization Config: Campaign is optimized on 'Schedule' (~3,723 events or ~108/week/ad-set, comfortably exiting Meta learning). 'Purchase' (473 events) and 'DemoAttended' are transmitted as offline Value Signals for Target ROAS / Value-Based Bidding (VBB).</w:t>
+        <w:t>• Signal Enrichment &amp; COPPA: Zero child PII sent to Meta. Only SHA-256 hashed parent contact data alongside fbclid/fbc, fbp, client IP, and User-Agent are transmitted for deterministic browser/server deduplication.</w:t>
       </w:r>
     </w:p>
     <w:p>
       <w:pPr>
-        <w:spacing w:before="120" w:after="40"/>
+        <w:spacing w:before="100" w:after="40"/>
       </w:pPr>
       <w:r>
         <w:rPr>
           <w:rFonts w:ascii="Calibri" w:hAnsi="Calibri"/>
           <w:b/>
           <w:color w:val="4338CA"/>
-          <w:sz w:val="21"/>
+          <w:sz w:val="20"/>
         </w:rPr>
-        <w:t>Dynamic Landing Page, Verification &amp; Reminder Cadence</w:t>
+        <w:t>Dynamic Intake UI, Verification &amp; Attendance Assurance</w:t>
       </w:r>
     </w:p>
     <w:p>
       <w:pPr>
-        <w:spacing w:before="0" w:after="60" w:line="276" w:lineRule="auto"/>
+        <w:spacing w:before="0" w:after="50" w:line="276" w:lineRule="auto"/>
       </w:pPr>
       <w:r>
         <w:rPr>
           <w:rFonts w:ascii="Calibri" w:hAnsi="Calibri"/>
           <w:color w:val="1E293B"/>
-          <w:sz w:val="18"/>
+          <w:sz w:val="17"/>
         </w:rPr>
         <w:t>• Self-Reported Laptop Readiness: Replaces mobile device penalty with explicit question ('Does your child have access to a laptop or desktop computer?').</w:t>
         <w:br/>
-        <w:t>• Mock Twilio SMS OTP: Validates 10-digit US phone numbers via 6-digit OTP (sandbox code: 123456).</w:t>
+        <w:t>• Mock Twilio SMS OTP: 6-digit verification (sandbox code: 123456) for drop-in Twilio Verify API.</w:t>
         <w:br/>
-        <w:t>• TCPA Consent Checkbox: Mandatory explicit consent for phone calls, SMS, and WhatsApp alerts.</w:t>
+        <w:t>• Guardian Attestation &amp; TCPA: Mandatory parent attestation and TCPA consent checkbox for call, SMS, WhatsApp alerts.</w:t>
         <w:br/>
-        <w:t>• Attendance Assurance: Confirmation screen locks &lt;=48h slots (1-click Google Calendar &amp; Apple .ics) and displays automated reminder cadence: T-24h (Email invite &amp; prep guide), T-2h (SMS Zoom link &amp; mentor bio), and T-15m (WhatsApp alert), with a low-friction reschedule link.</w:t>
+        <w:t>• Voucher A/B Testing: Running Tier 1 with a voucher ON vs OFF (Control) toggle to test if discounting undercuts premium positioning.</w:t>
+        <w:br/>
+        <w:t>• Attendance Assurance: Recommends 3 slots within 48h (Round 1 lag vs show rate link is correlational) + weekend slot toggle, 1-click Google/Apple sync, 3-channel reminders (T-24h Email, T-2h SMS, T-15m WhatsApp) and self-serve reschedule link.</w:t>
       </w:r>
     </w:p>
     <w:p>
       <w:pPr>
-        <w:spacing w:before="200" w:after="60"/>
+        <w:spacing w:before="180" w:after="60"/>
       </w:pPr>
       <w:r>
         <w:rPr>
           <w:rFonts w:ascii="Calibri" w:hAnsi="Calibri"/>
           <w:b/>
           <w:color w:val="1E1B4B"/>
-          <w:sz w:val="24"/>
+          <w:sz w:val="23"/>
         </w:rPr>
-        <w:t>4. Scenarios, Sensitivity &amp; Break-Even Analysis</w:t>
+        <w:t>5. Break-Even Thresholds &amp; Contribution Sensitivity</w:t>
       </w:r>
     </w:p>
     <w:p>
       <w:pPr>
-        <w:spacing w:before="0" w:after="60" w:line="276" w:lineRule="auto"/>
+        <w:spacing w:before="0" w:after="50" w:line="276" w:lineRule="auto"/>
       </w:pPr>
       <w:r>
         <w:rPr>
           <w:rFonts w:ascii="Calibri" w:hAnsi="Calibri"/>
           <w:color w:val="1E293B"/>
-          <w:sz w:val="18"/>
+          <w:sz w:val="17"/>
         </w:rPr>
-        <w:t>To ensure resilience against macro headwinds, we modeled three side-by-side scenarios at an assumed 55.0% gross margin (45% instructional delivery COGS):</w:t>
+        <w:t>Base contribution is $37,977.50 (10.3% margin on $367,550 revenue, before closers, payment fees, refunds, creative).</w:t>
       </w:r>
-    </w:p>
-    <w:tbl>
-      <w:tblPr>
-        <w:tblW w:type="auto" w:w="0"/>
-        <w:jc w:val="center"/>
-        <w:tblLook w:firstColumn="1" w:firstRow="1" w:lastColumn="0" w:lastRow="0" w:noHBand="0" w:noVBand="1" w:val="04A0"/>
-        <w:tblBorders>
-          <w:top w:val="single" w:sz="4" w:space="0" w:color="CBD5E1"/>
-          <w:bottom w:val="single" w:sz="4" w:space="0" w:color="CBD5E1"/>
-          <w:insideH w:val="single" w:sz="4" w:space="0" w:color="CBD5E1"/>
-          <w:left w:val="none"/>
-          <w:right w:val="none"/>
-          <w:insideV w:val="none"/>
-        </w:tblBorders>
-      </w:tblPr>
-      <w:tblGrid>
-        <w:gridCol w:w="2545"/>
-        <w:gridCol w:w="2545"/>
-        <w:gridCol w:w="2545"/>
-        <w:gridCol w:w="2545"/>
-      </w:tblGrid>
-      <w:tr>
-        <w:tc>
-          <w:tcPr>
-            <w:tcW w:type="dxa" w:w="2545"/>
-            <w:shd w:fill="1E1B4B"/>
-            <w:tcMar>
-              <w:top w:w="30" w:type="dxa"/>
-              <w:bottom w:w="30" w:type="dxa"/>
-              <w:left w:w="30" w:type="dxa"/>
-              <w:right w:w="30" w:type="dxa"/>
-            </w:tcMar>
-          </w:tcPr>
-          <w:p>
-            <w:r>
-              <w:rPr>
-                <w:rFonts w:ascii="Calibri" w:hAnsi="Calibri"/>
-                <w:b/>
-                <w:color w:val="FFFFFF"/>
-                <w:sz w:val="16"/>
-              </w:rPr>
-              <w:t>Metric / Parameter</w:t>
-            </w:r>
-          </w:p>
-        </w:tc>
-        <w:tc>
-          <w:tcPr>
-            <w:tcW w:type="dxa" w:w="2545"/>
-            <w:shd w:fill="1E1B4B"/>
-            <w:tcMar>
-              <w:top w:w="30" w:type="dxa"/>
-              <w:bottom w:w="30" w:type="dxa"/>
-              <w:left w:w="30" w:type="dxa"/>
-              <w:right w:w="30" w:type="dxa"/>
-            </w:tcMar>
-          </w:tcPr>
-          <w:p>
-            <w:r>
-              <w:rPr>
-                <w:rFonts w:ascii="Calibri" w:hAnsi="Calibri"/>
-                <w:b/>
-                <w:color w:val="FFFFFF"/>
-                <w:sz w:val="16"/>
-              </w:rPr>
-              <w:t>Downside (Stress Case)</w:t>
-            </w:r>
-          </w:p>
-        </w:tc>
-        <w:tc>
-          <w:tcPr>
-            <w:tcW w:type="dxa" w:w="2545"/>
-            <w:shd w:fill="1E1B4B"/>
-            <w:tcMar>
-              <w:top w:w="30" w:type="dxa"/>
-              <w:bottom w:w="30" w:type="dxa"/>
-              <w:left w:w="30" w:type="dxa"/>
-              <w:right w:w="30" w:type="dxa"/>
-            </w:tcMar>
-          </w:tcPr>
-          <w:p>
-            <w:r>
-              <w:rPr>
-                <w:rFonts w:ascii="Calibri" w:hAnsi="Calibri"/>
-                <w:b/>
-                <w:color w:val="FFFFFF"/>
-                <w:sz w:val="16"/>
-              </w:rPr>
-              <w:t>Base Case (Recommended)</w:t>
-            </w:r>
-          </w:p>
-        </w:tc>
-        <w:tc>
-          <w:tcPr>
-            <w:tcW w:type="dxa" w:w="2545"/>
-            <w:shd w:fill="1E1B4B"/>
-            <w:tcMar>
-              <w:top w:w="30" w:type="dxa"/>
-              <w:bottom w:w="30" w:type="dxa"/>
-              <w:left w:w="30" w:type="dxa"/>
-              <w:right w:w="30" w:type="dxa"/>
-            </w:tcMar>
-          </w:tcPr>
-          <w:p>
-            <w:r>
-              <w:rPr>
-                <w:rFonts w:ascii="Calibri" w:hAnsi="Calibri"/>
-                <w:b/>
-                <w:color w:val="FFFFFF"/>
-                <w:sz w:val="16"/>
-              </w:rPr>
-              <w:t>Upside (Outperform)</w:t>
-            </w:r>
-          </w:p>
-        </w:tc>
-      </w:tr>
-      <w:tr>
-        <w:tc>
-          <w:tcPr>
-            <w:tcW w:type="dxa" w:w="2545"/>
-            <w:shd w:fill="F8FAFC"/>
-            <w:tcMar>
-              <w:top w:w="25" w:type="dxa"/>
-              <w:bottom w:w="25" w:type="dxa"/>
-              <w:left w:w="30" w:type="dxa"/>
-              <w:right w:w="30" w:type="dxa"/>
-            </w:tcMar>
-          </w:tcPr>
-          <w:p>
-            <w:r>
-              <w:rPr>
-                <w:rFonts w:ascii="Calibri" w:hAnsi="Calibri"/>
-                <w:color w:val="1E293B"/>
-                <w:sz w:val="16"/>
-              </w:rPr>
-              <w:t>Blended CPL ($)</w:t>
-            </w:r>
-          </w:p>
-        </w:tc>
-        <w:tc>
-          <w:tcPr>
-            <w:tcW w:type="dxa" w:w="2545"/>
-            <w:shd w:fill="F8FAFC"/>
-            <w:tcMar>
-              <w:top w:w="25" w:type="dxa"/>
-              <w:bottom w:w="25" w:type="dxa"/>
-              <w:left w:w="30" w:type="dxa"/>
-              <w:right w:w="30" w:type="dxa"/>
-            </w:tcMar>
-          </w:tcPr>
-          <w:p>
-            <w:r>
-              <w:rPr>
-                <w:rFonts w:ascii="Calibri" w:hAnsi="Calibri"/>
-                <w:color w:val="1E293B"/>
-                <w:sz w:val="16"/>
-              </w:rPr>
-              <w:t>$34.33 (+15% CPM surge)</w:t>
-            </w:r>
-          </w:p>
-        </w:tc>
-        <w:tc>
-          <w:tcPr>
-            <w:tcW w:type="dxa" w:w="2545"/>
-            <w:shd w:fill="F8FAFC"/>
-            <w:tcMar>
-              <w:top w:w="25" w:type="dxa"/>
-              <w:bottom w:w="25" w:type="dxa"/>
-              <w:left w:w="30" w:type="dxa"/>
-              <w:right w:w="30" w:type="dxa"/>
-            </w:tcMar>
-          </w:tcPr>
-          <w:p>
-            <w:r>
-              <w:rPr>
-                <w:rFonts w:ascii="Calibri" w:hAnsi="Calibri"/>
-                <w:b/>
-                <w:color w:val="1E1B4B"/>
-                <w:sz w:val="16"/>
-              </w:rPr>
-              <w:t>$29.85</w:t>
-            </w:r>
-          </w:p>
-        </w:tc>
-        <w:tc>
-          <w:tcPr>
-            <w:tcW w:type="dxa" w:w="2545"/>
-            <w:shd w:fill="F8FAFC"/>
-            <w:tcMar>
-              <w:top w:w="25" w:type="dxa"/>
-              <w:bottom w:w="25" w:type="dxa"/>
-              <w:left w:w="30" w:type="dxa"/>
-              <w:right w:w="30" w:type="dxa"/>
-            </w:tcMar>
-          </w:tcPr>
-          <w:p>
-            <w:r>
-              <w:rPr>
-                <w:rFonts w:ascii="Calibri" w:hAnsi="Calibri"/>
-                <w:color w:val="1E293B"/>
-                <w:sz w:val="16"/>
-              </w:rPr>
-              <w:t>$26.87 (-10% cost)</w:t>
-            </w:r>
-          </w:p>
-        </w:tc>
-      </w:tr>
-      <w:tr>
-        <w:tc>
-          <w:tcPr>
-            <w:tcW w:type="dxa" w:w="2545"/>
-            <w:shd w:fill="FFFFFF"/>
-            <w:tcMar>
-              <w:top w:w="25" w:type="dxa"/>
-              <w:bottom w:w="25" w:type="dxa"/>
-              <w:left w:w="30" w:type="dxa"/>
-              <w:right w:w="30" w:type="dxa"/>
-            </w:tcMar>
-          </w:tcPr>
-          <w:p>
-            <w:r>
-              <w:rPr>
-                <w:rFonts w:ascii="Calibri" w:hAnsi="Calibri"/>
-                <w:color w:val="1E293B"/>
-                <w:sz w:val="16"/>
-              </w:rPr>
-              <w:t>Media Spend ($)</w:t>
-            </w:r>
-          </w:p>
-        </w:tc>
-        <w:tc>
-          <w:tcPr>
-            <w:tcW w:type="dxa" w:w="2545"/>
-            <w:shd w:fill="FFFFFF"/>
-            <w:tcMar>
-              <w:top w:w="25" w:type="dxa"/>
-              <w:bottom w:w="25" w:type="dxa"/>
-              <w:left w:w="30" w:type="dxa"/>
-              <w:right w:w="30" w:type="dxa"/>
-            </w:tcMar>
-          </w:tcPr>
-          <w:p>
-            <w:r>
-              <w:rPr>
-                <w:rFonts w:ascii="Calibri" w:hAnsi="Calibri"/>
-                <w:color w:val="1E293B"/>
-                <w:sz w:val="16"/>
-              </w:rPr>
-              <w:t>$188,801.25</w:t>
-            </w:r>
-          </w:p>
-        </w:tc>
-        <w:tc>
-          <w:tcPr>
-            <w:tcW w:type="dxa" w:w="2545"/>
-            <w:shd w:fill="FFFFFF"/>
-            <w:tcMar>
-              <w:top w:w="25" w:type="dxa"/>
-              <w:bottom w:w="25" w:type="dxa"/>
-              <w:left w:w="30" w:type="dxa"/>
-              <w:right w:w="30" w:type="dxa"/>
-            </w:tcMar>
-          </w:tcPr>
-          <w:p>
-            <w:r>
-              <w:rPr>
-                <w:rFonts w:ascii="Calibri" w:hAnsi="Calibri"/>
-                <w:b/>
-                <w:color w:val="1E1B4B"/>
-                <w:sz w:val="16"/>
-              </w:rPr>
-              <w:t>$164,175.00</w:t>
-            </w:r>
-          </w:p>
-        </w:tc>
-        <w:tc>
-          <w:tcPr>
-            <w:tcW w:type="dxa" w:w="2545"/>
-            <w:shd w:fill="FFFFFF"/>
-            <w:tcMar>
-              <w:top w:w="25" w:type="dxa"/>
-              <w:bottom w:w="25" w:type="dxa"/>
-              <w:left w:w="30" w:type="dxa"/>
-              <w:right w:w="30" w:type="dxa"/>
-            </w:tcMar>
-          </w:tcPr>
-          <w:p>
-            <w:r>
-              <w:rPr>
-                <w:rFonts w:ascii="Calibri" w:hAnsi="Calibri"/>
-                <w:color w:val="1E293B"/>
-                <w:sz w:val="16"/>
-              </w:rPr>
-              <w:t>$147,757.50</w:t>
-            </w:r>
-          </w:p>
-        </w:tc>
-      </w:tr>
-      <w:tr>
-        <w:tc>
-          <w:tcPr>
-            <w:tcW w:type="dxa" w:w="2545"/>
-            <w:shd w:fill="F8FAFC"/>
-            <w:tcMar>
-              <w:top w:w="25" w:type="dxa"/>
-              <w:bottom w:w="25" w:type="dxa"/>
-              <w:left w:w="30" w:type="dxa"/>
-              <w:right w:w="30" w:type="dxa"/>
-            </w:tcMar>
-          </w:tcPr>
-          <w:p>
-            <w:r>
-              <w:rPr>
-                <w:rFonts w:ascii="Calibri" w:hAnsi="Calibri"/>
-                <w:color w:val="1E293B"/>
-                <w:sz w:val="16"/>
-              </w:rPr>
-              <w:t>Demo Show Rate (%)</w:t>
-            </w:r>
-          </w:p>
-        </w:tc>
-        <w:tc>
-          <w:tcPr>
-            <w:tcW w:type="dxa" w:w="2545"/>
-            <w:shd w:fill="F8FAFC"/>
-            <w:tcMar>
-              <w:top w:w="25" w:type="dxa"/>
-              <w:bottom w:w="25" w:type="dxa"/>
-              <w:left w:w="30" w:type="dxa"/>
-              <w:right w:w="30" w:type="dxa"/>
-            </w:tcMar>
-          </w:tcPr>
-          <w:p>
-            <w:r>
-              <w:rPr>
-                <w:rFonts w:ascii="Calibri" w:hAnsi="Calibri"/>
-                <w:color w:val="1E293B"/>
-                <w:sz w:val="16"/>
-              </w:rPr>
-              <w:t>55.0% (Ghosting surge)</w:t>
-            </w:r>
-          </w:p>
-        </w:tc>
-        <w:tc>
-          <w:tcPr>
-            <w:tcW w:type="dxa" w:w="2545"/>
-            <w:shd w:fill="F8FAFC"/>
-            <w:tcMar>
-              <w:top w:w="25" w:type="dxa"/>
-              <w:bottom w:w="25" w:type="dxa"/>
-              <w:left w:w="30" w:type="dxa"/>
-              <w:right w:w="30" w:type="dxa"/>
-            </w:tcMar>
-          </w:tcPr>
-          <w:p>
-            <w:r>
-              <w:rPr>
-                <w:rFonts w:ascii="Calibri" w:hAnsi="Calibri"/>
-                <w:b/>
-                <w:color w:val="1E1B4B"/>
-                <w:sz w:val="16"/>
-              </w:rPr>
-              <w:t>71.0%</w:t>
-            </w:r>
-          </w:p>
-        </w:tc>
-        <w:tc>
-          <w:tcPr>
-            <w:tcW w:type="dxa" w:w="2545"/>
-            <w:shd w:fill="F8FAFC"/>
-            <w:tcMar>
-              <w:top w:w="25" w:type="dxa"/>
-              <w:bottom w:w="25" w:type="dxa"/>
-              <w:left w:w="30" w:type="dxa"/>
-              <w:right w:w="30" w:type="dxa"/>
-            </w:tcMar>
-          </w:tcPr>
-          <w:p>
-            <w:r>
-              <w:rPr>
-                <w:rFonts w:ascii="Calibri" w:hAnsi="Calibri"/>
-                <w:color w:val="1E293B"/>
-                <w:sz w:val="16"/>
-              </w:rPr>
-              <w:t>76.0%</w:t>
-            </w:r>
-          </w:p>
-        </w:tc>
-      </w:tr>
-      <w:tr>
-        <w:tc>
-          <w:tcPr>
-            <w:tcW w:type="dxa" w:w="2545"/>
-            <w:shd w:fill="FFFFFF"/>
-            <w:tcMar>
-              <w:top w:w="25" w:type="dxa"/>
-              <w:bottom w:w="25" w:type="dxa"/>
-              <w:left w:w="30" w:type="dxa"/>
-              <w:right w:w="30" w:type="dxa"/>
-            </w:tcMar>
-          </w:tcPr>
-          <w:p>
-            <w:r>
-              <w:rPr>
-                <w:rFonts w:ascii="Calibri" w:hAnsi="Calibri"/>
-                <w:color w:val="1E293B"/>
-                <w:sz w:val="16"/>
-              </w:rPr>
-              <w:t>Enrolled Paid Students</w:t>
-            </w:r>
-          </w:p>
-        </w:tc>
-        <w:tc>
-          <w:tcPr>
-            <w:tcW w:type="dxa" w:w="2545"/>
-            <w:shd w:fill="FFFFFF"/>
-            <w:tcMar>
-              <w:top w:w="25" w:type="dxa"/>
-              <w:bottom w:w="25" w:type="dxa"/>
-              <w:left w:w="30" w:type="dxa"/>
-              <w:right w:w="30" w:type="dxa"/>
-            </w:tcMar>
-          </w:tcPr>
-          <w:p>
-            <w:r>
-              <w:rPr>
-                <w:rFonts w:ascii="Calibri" w:hAnsi="Calibri"/>
-                <w:color w:val="1E293B"/>
-                <w:sz w:val="16"/>
-              </w:rPr>
-              <w:t>262 Students</w:t>
-            </w:r>
-          </w:p>
-        </w:tc>
-        <w:tc>
-          <w:tcPr>
-            <w:tcW w:type="dxa" w:w="2545"/>
-            <w:shd w:fill="FFFFFF"/>
-            <w:tcMar>
-              <w:top w:w="25" w:type="dxa"/>
-              <w:bottom w:w="25" w:type="dxa"/>
-              <w:left w:w="30" w:type="dxa"/>
-              <w:right w:w="30" w:type="dxa"/>
-            </w:tcMar>
-          </w:tcPr>
-          <w:p>
-            <w:r>
-              <w:rPr>
-                <w:rFonts w:ascii="Calibri" w:hAnsi="Calibri"/>
-                <w:b/>
-                <w:color w:val="1E1B4B"/>
-                <w:sz w:val="16"/>
-              </w:rPr>
-              <w:t>473 Students</w:t>
-            </w:r>
-          </w:p>
-        </w:tc>
-        <w:tc>
-          <w:tcPr>
-            <w:tcW w:type="dxa" w:w="2545"/>
-            <w:shd w:fill="FFFFFF"/>
-            <w:tcMar>
-              <w:top w:w="25" w:type="dxa"/>
-              <w:bottom w:w="25" w:type="dxa"/>
-              <w:left w:w="30" w:type="dxa"/>
-              <w:right w:w="30" w:type="dxa"/>
-            </w:tcMar>
-          </w:tcPr>
-          <w:p>
-            <w:r>
-              <w:rPr>
-                <w:rFonts w:ascii="Calibri" w:hAnsi="Calibri"/>
-                <w:color w:val="1E293B"/>
-                <w:sz w:val="16"/>
-              </w:rPr>
-              <w:t>585 Students</w:t>
-            </w:r>
-          </w:p>
-        </w:tc>
-      </w:tr>
-      <w:tr>
-        <w:tc>
-          <w:tcPr>
-            <w:tcW w:type="dxa" w:w="2545"/>
-            <w:shd w:fill="F8FAFC"/>
-            <w:tcMar>
-              <w:top w:w="25" w:type="dxa"/>
-              <w:bottom w:w="25" w:type="dxa"/>
-              <w:left w:w="30" w:type="dxa"/>
-              <w:right w:w="30" w:type="dxa"/>
-            </w:tcMar>
-          </w:tcPr>
-          <w:p>
-            <w:r>
-              <w:rPr>
-                <w:rFonts w:ascii="Calibri" w:hAnsi="Calibri"/>
-                <w:color w:val="1E293B"/>
-                <w:sz w:val="16"/>
-              </w:rPr>
-              <w:t>Blended CAC ($)</w:t>
-            </w:r>
-          </w:p>
-        </w:tc>
-        <w:tc>
-          <w:tcPr>
-            <w:tcW w:type="dxa" w:w="2545"/>
-            <w:shd w:fill="F8FAFC"/>
-            <w:tcMar>
-              <w:top w:w="25" w:type="dxa"/>
-              <w:bottom w:w="25" w:type="dxa"/>
-              <w:left w:w="30" w:type="dxa"/>
-              <w:right w:w="30" w:type="dxa"/>
-            </w:tcMar>
-          </w:tcPr>
-          <w:p>
-            <w:r>
-              <w:rPr>
-                <w:rFonts w:ascii="Calibri" w:hAnsi="Calibri"/>
-                <w:color w:val="1E293B"/>
-                <w:sz w:val="16"/>
-              </w:rPr>
-              <w:t>$720.62</w:t>
-            </w:r>
-          </w:p>
-        </w:tc>
-        <w:tc>
-          <w:tcPr>
-            <w:tcW w:type="dxa" w:w="2545"/>
-            <w:shd w:fill="F8FAFC"/>
-            <w:tcMar>
-              <w:top w:w="25" w:type="dxa"/>
-              <w:bottom w:w="25" w:type="dxa"/>
-              <w:left w:w="30" w:type="dxa"/>
-              <w:right w:w="30" w:type="dxa"/>
-            </w:tcMar>
-          </w:tcPr>
-          <w:p>
-            <w:r>
-              <w:rPr>
-                <w:rFonts w:ascii="Calibri" w:hAnsi="Calibri"/>
-                <w:b/>
-                <w:color w:val="1E1B4B"/>
-                <w:sz w:val="16"/>
-              </w:rPr>
-              <w:t>$347.09</w:t>
-            </w:r>
-          </w:p>
-        </w:tc>
-        <w:tc>
-          <w:tcPr>
-            <w:tcW w:type="dxa" w:w="2545"/>
-            <w:shd w:fill="F8FAFC"/>
-            <w:tcMar>
-              <w:top w:w="25" w:type="dxa"/>
-              <w:bottom w:w="25" w:type="dxa"/>
-              <w:left w:w="30" w:type="dxa"/>
-              <w:right w:w="30" w:type="dxa"/>
-            </w:tcMar>
-          </w:tcPr>
-          <w:p>
-            <w:r>
-              <w:rPr>
-                <w:rFonts w:ascii="Calibri" w:hAnsi="Calibri"/>
-                <w:color w:val="1E293B"/>
-                <w:sz w:val="16"/>
-              </w:rPr>
-              <w:t>$252.58</w:t>
-            </w:r>
-          </w:p>
-        </w:tc>
-      </w:tr>
-      <w:tr>
-        <w:tc>
-          <w:tcPr>
-            <w:tcW w:type="dxa" w:w="2545"/>
-            <w:shd w:fill="FFFFFF"/>
-            <w:tcMar>
-              <w:top w:w="25" w:type="dxa"/>
-              <w:bottom w:w="25" w:type="dxa"/>
-              <w:left w:w="30" w:type="dxa"/>
-              <w:right w:w="30" w:type="dxa"/>
-            </w:tcMar>
-          </w:tcPr>
-          <w:p>
-            <w:r>
-              <w:rPr>
-                <w:rFonts w:ascii="Calibri" w:hAnsi="Calibri"/>
-                <w:color w:val="1E293B"/>
-                <w:sz w:val="16"/>
-              </w:rPr>
-              <w:t>Net Booked Revenue ($)</w:t>
-            </w:r>
-          </w:p>
-        </w:tc>
-        <w:tc>
-          <w:tcPr>
-            <w:tcW w:type="dxa" w:w="2545"/>
-            <w:shd w:fill="FFFFFF"/>
-            <w:tcMar>
-              <w:top w:w="25" w:type="dxa"/>
-              <w:bottom w:w="25" w:type="dxa"/>
-              <w:left w:w="30" w:type="dxa"/>
-              <w:right w:w="30" w:type="dxa"/>
-            </w:tcMar>
-          </w:tcPr>
-          <w:p>
-            <w:r>
-              <w:rPr>
-                <w:rFonts w:ascii="Calibri" w:hAnsi="Calibri"/>
-                <w:color w:val="1E293B"/>
-                <w:sz w:val="16"/>
-              </w:rPr>
-              <w:t>$193,880.00</w:t>
-            </w:r>
-          </w:p>
-        </w:tc>
-        <w:tc>
-          <w:tcPr>
-            <w:tcW w:type="dxa" w:w="2545"/>
-            <w:shd w:fill="FFFFFF"/>
-            <w:tcMar>
-              <w:top w:w="25" w:type="dxa"/>
-              <w:bottom w:w="25" w:type="dxa"/>
-              <w:left w:w="30" w:type="dxa"/>
-              <w:right w:w="30" w:type="dxa"/>
-            </w:tcMar>
-          </w:tcPr>
-          <w:p>
-            <w:r>
-              <w:rPr>
-                <w:rFonts w:ascii="Calibri" w:hAnsi="Calibri"/>
-                <w:b/>
-                <w:color w:val="1E1B4B"/>
-                <w:sz w:val="16"/>
-              </w:rPr>
-              <w:t>$367,550.00</w:t>
-            </w:r>
-          </w:p>
-        </w:tc>
-        <w:tc>
-          <w:tcPr>
-            <w:tcW w:type="dxa" w:w="2545"/>
-            <w:shd w:fill="FFFFFF"/>
-            <w:tcMar>
-              <w:top w:w="25" w:type="dxa"/>
-              <w:bottom w:w="25" w:type="dxa"/>
-              <w:left w:w="30" w:type="dxa"/>
-              <w:right w:w="30" w:type="dxa"/>
-            </w:tcMar>
-          </w:tcPr>
-          <w:p>
-            <w:r>
-              <w:rPr>
-                <w:rFonts w:ascii="Calibri" w:hAnsi="Calibri"/>
-                <w:color w:val="1E293B"/>
-                <w:sz w:val="16"/>
-              </w:rPr>
-              <w:t>$447,525.00</w:t>
-            </w:r>
-          </w:p>
-        </w:tc>
-      </w:tr>
-      <w:tr>
-        <w:tc>
-          <w:tcPr>
-            <w:tcW w:type="dxa" w:w="2545"/>
-            <w:shd w:fill="F8FAFC"/>
-            <w:tcMar>
-              <w:top w:w="25" w:type="dxa"/>
-              <w:bottom w:w="25" w:type="dxa"/>
-              <w:left w:w="30" w:type="dxa"/>
-              <w:right w:w="30" w:type="dxa"/>
-            </w:tcMar>
-          </w:tcPr>
-          <w:p>
-            <w:r>
-              <w:rPr>
-                <w:rFonts w:ascii="Calibri" w:hAnsi="Calibri"/>
-                <w:color w:val="1E293B"/>
-                <w:sz w:val="16"/>
-              </w:rPr>
-              <w:t>First-Order ROAS</w:t>
-            </w:r>
-          </w:p>
-        </w:tc>
-        <w:tc>
-          <w:tcPr>
-            <w:tcW w:type="dxa" w:w="2545"/>
-            <w:shd w:fill="F8FAFC"/>
-            <w:tcMar>
-              <w:top w:w="25" w:type="dxa"/>
-              <w:bottom w:w="25" w:type="dxa"/>
-              <w:left w:w="30" w:type="dxa"/>
-              <w:right w:w="30" w:type="dxa"/>
-            </w:tcMar>
-          </w:tcPr>
-          <w:p>
-            <w:r>
-              <w:rPr>
-                <w:rFonts w:ascii="Calibri" w:hAnsi="Calibri"/>
-                <w:color w:val="1E293B"/>
-                <w:sz w:val="16"/>
-              </w:rPr>
-              <w:t>1.03x</w:t>
-            </w:r>
-          </w:p>
-        </w:tc>
-        <w:tc>
-          <w:tcPr>
-            <w:tcW w:type="dxa" w:w="2545"/>
-            <w:shd w:fill="F8FAFC"/>
-            <w:tcMar>
-              <w:top w:w="25" w:type="dxa"/>
-              <w:bottom w:w="25" w:type="dxa"/>
-              <w:left w:w="30" w:type="dxa"/>
-              <w:right w:w="30" w:type="dxa"/>
-            </w:tcMar>
-          </w:tcPr>
-          <w:p>
-            <w:r>
-              <w:rPr>
-                <w:rFonts w:ascii="Calibri" w:hAnsi="Calibri"/>
-                <w:b/>
-                <w:color w:val="1E1B4B"/>
-                <w:sz w:val="16"/>
-              </w:rPr>
-              <w:t>2.24x</w:t>
-            </w:r>
-          </w:p>
-        </w:tc>
-        <w:tc>
-          <w:tcPr>
-            <w:tcW w:type="dxa" w:w="2545"/>
-            <w:shd w:fill="F8FAFC"/>
-            <w:tcMar>
-              <w:top w:w="25" w:type="dxa"/>
-              <w:bottom w:w="25" w:type="dxa"/>
-              <w:left w:w="30" w:type="dxa"/>
-              <w:right w:w="30" w:type="dxa"/>
-            </w:tcMar>
-          </w:tcPr>
-          <w:p>
-            <w:r>
-              <w:rPr>
-                <w:rFonts w:ascii="Calibri" w:hAnsi="Calibri"/>
-                <w:color w:val="1E293B"/>
-                <w:sz w:val="16"/>
-              </w:rPr>
-              <w:t>3.03x</w:t>
-            </w:r>
-          </w:p>
-        </w:tc>
-      </w:tr>
-      <w:tr>
-        <w:tc>
-          <w:tcPr>
-            <w:tcW w:type="dxa" w:w="2545"/>
-            <w:shd w:fill="FEE2E2"/>
-            <w:tcMar>
-              <w:top w:w="25" w:type="dxa"/>
-              <w:bottom w:w="25" w:type="dxa"/>
-              <w:left w:w="30" w:type="dxa"/>
-              <w:right w:w="30" w:type="dxa"/>
-            </w:tcMar>
-          </w:tcPr>
-          <w:p>
-            <w:r>
-              <w:rPr>
-                <w:rFonts w:ascii="Calibri" w:hAnsi="Calibri"/>
-                <w:color w:val="1E293B"/>
-                <w:sz w:val="16"/>
-              </w:rPr>
-              <w:t>Contribution Margin ($)</w:t>
-            </w:r>
-          </w:p>
-        </w:tc>
-        <w:tc>
-          <w:tcPr>
-            <w:tcW w:type="dxa" w:w="2545"/>
-            <w:shd w:fill="FEE2E2"/>
-            <w:tcMar>
-              <w:top w:w="25" w:type="dxa"/>
-              <w:bottom w:w="25" w:type="dxa"/>
-              <w:left w:w="30" w:type="dxa"/>
-              <w:right w:w="30" w:type="dxa"/>
-            </w:tcMar>
-          </w:tcPr>
-          <w:p>
-            <w:r>
-              <w:rPr>
-                <w:rFonts w:ascii="Calibri" w:hAnsi="Calibri"/>
-                <w:color w:val="1E293B"/>
-                <w:sz w:val="16"/>
-              </w:rPr>
-              <w:t>-$82,167.25</w:t>
-            </w:r>
-          </w:p>
-        </w:tc>
-        <w:tc>
-          <w:tcPr>
-            <w:tcW w:type="dxa" w:w="2545"/>
-            <w:shd w:fill="FEE2E2"/>
-            <w:tcMar>
-              <w:top w:w="25" w:type="dxa"/>
-              <w:bottom w:w="25" w:type="dxa"/>
-              <w:left w:w="30" w:type="dxa"/>
-              <w:right w:w="30" w:type="dxa"/>
-            </w:tcMar>
-          </w:tcPr>
-          <w:p>
-            <w:r>
-              <w:rPr>
-                <w:rFonts w:ascii="Calibri" w:hAnsi="Calibri"/>
-                <w:b/>
-                <w:color w:val="1E1B4B"/>
-                <w:sz w:val="16"/>
-              </w:rPr>
-              <w:t>+$37,977.50</w:t>
-            </w:r>
-          </w:p>
-        </w:tc>
-        <w:tc>
-          <w:tcPr>
-            <w:tcW w:type="dxa" w:w="2545"/>
-            <w:shd w:fill="FEE2E2"/>
-            <w:tcMar>
-              <w:top w:w="25" w:type="dxa"/>
-              <w:bottom w:w="25" w:type="dxa"/>
-              <w:left w:w="30" w:type="dxa"/>
-              <w:right w:w="30" w:type="dxa"/>
-            </w:tcMar>
-          </w:tcPr>
-          <w:p>
-            <w:r>
-              <w:rPr>
-                <w:rFonts w:ascii="Calibri" w:hAnsi="Calibri"/>
-                <w:color w:val="1E293B"/>
-                <w:sz w:val="16"/>
-              </w:rPr>
-              <w:t>+$98,381.25</w:t>
-            </w:r>
-          </w:p>
-        </w:tc>
-      </w:tr>
-    </w:tbl>
-    <w:p>
-      <w:pPr>
-        <w:spacing w:after="80"/>
-      </w:pPr>
     </w:p>
     <w:tbl>
       <w:tblPr>
@@ -2362,18 +2046,18 @@
         <w:tblLook w:firstColumn="1" w:firstRow="1" w:lastColumn="0" w:lastRow="0" w:noHBand="0" w:noVBand="1" w:val="04A0"/>
       </w:tblPr>
       <w:tblGrid>
-        <w:gridCol w:w="10181"/>
+        <w:gridCol w:w="10325"/>
       </w:tblGrid>
       <w:tr>
         <w:tc>
           <w:tcPr>
-            <w:tcW w:type="dxa" w:w="10181"/>
+            <w:tcW w:type="dxa" w:w="10325"/>
             <w:shd w:fill="EEF2FF"/>
             <w:tcMar>
-              <w:top w:w="80" w:type="dxa"/>
-              <w:bottom w:w="80" w:type="dxa"/>
-              <w:left w:w="120" w:type="dxa"/>
-              <w:right w:w="120" w:type="dxa"/>
+              <w:top w:w="60" w:type="dxa"/>
+              <w:bottom w:w="60" w:type="dxa"/>
+              <w:left w:w="100" w:type="dxa"/>
+              <w:right w:w="100" w:type="dxa"/>
             </w:tcMar>
             <w:tcBorders>
               <w:left w:val="single" w:sz="24" w:space="0" w:color="4338CA"/>
@@ -2391,22 +2075,26 @@
                 <w:rFonts w:ascii="Calibri" w:hAnsi="Calibri"/>
                 <w:b/>
                 <w:color w:val="4338CA"/>
-                <w:sz w:val="17"/>
+                <w:sz w:val="16"/>
               </w:rPr>
-              <w:t>[FINANCIAL SUSTAINABILITY PROOF]</w:t>
+              <w:t>[BREAK-EVEN THRESHOLDS]</w:t>
               <w:br/>
             </w:r>
             <w:r>
               <w:rPr>
                 <w:rFonts w:ascii="Calibri" w:hAnsi="Calibri"/>
                 <w:color w:val="1E293B"/>
-                <w:sz w:val="18"/>
+                <w:sz w:val="17"/>
               </w:rPr>
-              <w:t>BREAK-EVEN ROAS PROOF AT 55% GROSS MARGIN:</w:t>
+              <w:t>BREAK-EVEN THRESHOLDS (FINANCIAL GUARDRAILS):</w:t>
               <w:br/>
-              <w:t>Break-Even ROAS = 1 / Gross Margin = 1 / 0.55 = 1.82x.</w:t>
+              <w:t>• Break-Even CPL: $36.76 (Maximum allowable blended CPL before contribution turns negative: $367,550 x 0.55 / 5,500).</w:t>
               <w:br/>
-              <w:t>Our Base Case achieves 2.24x ROAS, securing $37,977.50 in net contribution profit from Day 1.</w:t>
+              <w:t>• Break-Even Gross Margin: 44.7% (Minimum delivery gross margin required to cover $164,175 media spend: $164,175 / $367,550).</w:t>
+              <w:br/>
+              <w:t>• Break-Even Close Rate: 14.5% (Minimum demo-to-paid close rate required at 2,643 attended demos).</w:t>
+              <w:br/>
+              <w:t>• Break-Even Media ROAS: 1.82x (1.00 / 0.55 GM) | Base Case ROAS: 2.24x (23% safety buffer above break-even).</w:t>
             </w:r>
           </w:p>
         </w:tc>
@@ -2414,152 +2102,829 @@
     </w:tbl>
     <w:p>
       <w:pPr>
-        <w:spacing w:after="60"/>
+        <w:spacing w:after="40"/>
       </w:pPr>
     </w:p>
+    <w:tbl>
+      <w:tblPr>
+        <w:tblW w:type="auto" w:w="0"/>
+        <w:jc w:val="center"/>
+        <w:tblLook w:firstColumn="1" w:firstRow="1" w:lastColumn="0" w:lastRow="0" w:noHBand="0" w:noVBand="1" w:val="04A0"/>
+        <w:tblBorders>
+          <w:top w:val="single" w:sz="4" w:space="0" w:color="CBD5E1"/>
+          <w:bottom w:val="single" w:sz="4" w:space="0" w:color="CBD5E1"/>
+          <w:insideH w:val="single" w:sz="4" w:space="0" w:color="CBD5E1"/>
+          <w:left w:val="none"/>
+          <w:right w:val="none"/>
+          <w:insideV w:val="none"/>
+        </w:tblBorders>
+      </w:tblPr>
+      <w:tblGrid>
+        <w:gridCol w:w="2065"/>
+        <w:gridCol w:w="2065"/>
+        <w:gridCol w:w="2065"/>
+        <w:gridCol w:w="2065"/>
+        <w:gridCol w:w="2065"/>
+      </w:tblGrid>
+      <w:tr>
+        <w:tc>
+          <w:tcPr>
+            <w:tcW w:type="dxa" w:w="2065"/>
+            <w:shd w:fill="1E1B4B"/>
+            <w:tcMar>
+              <w:top w:w="25" w:type="dxa"/>
+              <w:bottom w:w="25" w:type="dxa"/>
+              <w:left w:w="20" w:type="dxa"/>
+              <w:right w:w="20" w:type="dxa"/>
+            </w:tcMar>
+          </w:tcPr>
+          <w:p>
+            <w:r>
+              <w:rPr>
+                <w:rFonts w:ascii="Calibri" w:hAnsi="Calibri"/>
+                <w:b/>
+                <w:color w:val="FFFFFF"/>
+                <w:sz w:val="16"/>
+              </w:rPr>
+              <w:t>Stress Scenario</w:t>
+            </w:r>
+          </w:p>
+        </w:tc>
+        <w:tc>
+          <w:tcPr>
+            <w:tcW w:type="dxa" w:w="2065"/>
+            <w:shd w:fill="1E1B4B"/>
+            <w:tcMar>
+              <w:top w:w="25" w:type="dxa"/>
+              <w:bottom w:w="25" w:type="dxa"/>
+              <w:left w:w="20" w:type="dxa"/>
+              <w:right w:w="20" w:type="dxa"/>
+            </w:tcMar>
+          </w:tcPr>
+          <w:p>
+            <w:r>
+              <w:rPr>
+                <w:rFonts w:ascii="Calibri" w:hAnsi="Calibri"/>
+                <w:b/>
+                <w:color w:val="FFFFFF"/>
+                <w:sz w:val="16"/>
+              </w:rPr>
+              <w:t>Operating Condition</w:t>
+            </w:r>
+          </w:p>
+        </w:tc>
+        <w:tc>
+          <w:tcPr>
+            <w:tcW w:type="dxa" w:w="2065"/>
+            <w:shd w:fill="1E1B4B"/>
+            <w:tcMar>
+              <w:top w:w="25" w:type="dxa"/>
+              <w:bottom w:w="25" w:type="dxa"/>
+              <w:left w:w="20" w:type="dxa"/>
+              <w:right w:w="20" w:type="dxa"/>
+            </w:tcMar>
+          </w:tcPr>
+          <w:p>
+            <w:r>
+              <w:rPr>
+                <w:rFonts w:ascii="Calibri" w:hAnsi="Calibri"/>
+                <w:b/>
+                <w:color w:val="FFFFFF"/>
+                <w:sz w:val="16"/>
+              </w:rPr>
+              <w:t>Media Spend</w:t>
+            </w:r>
+          </w:p>
+        </w:tc>
+        <w:tc>
+          <w:tcPr>
+            <w:tcW w:type="dxa" w:w="2065"/>
+            <w:shd w:fill="1E1B4B"/>
+            <w:tcMar>
+              <w:top w:w="25" w:type="dxa"/>
+              <w:bottom w:w="25" w:type="dxa"/>
+              <w:left w:w="20" w:type="dxa"/>
+              <w:right w:w="20" w:type="dxa"/>
+            </w:tcMar>
+          </w:tcPr>
+          <w:p>
+            <w:r>
+              <w:rPr>
+                <w:rFonts w:ascii="Calibri" w:hAnsi="Calibri"/>
+                <w:b/>
+                <w:color w:val="FFFFFF"/>
+                <w:sz w:val="16"/>
+              </w:rPr>
+              <w:t>Contribution Margin</w:t>
+            </w:r>
+          </w:p>
+        </w:tc>
+        <w:tc>
+          <w:tcPr>
+            <w:tcW w:type="dxa" w:w="2065"/>
+            <w:shd w:fill="1E1B4B"/>
+            <w:tcMar>
+              <w:top w:w="25" w:type="dxa"/>
+              <w:bottom w:w="25" w:type="dxa"/>
+              <w:left w:w="20" w:type="dxa"/>
+              <w:right w:w="20" w:type="dxa"/>
+            </w:tcMar>
+          </w:tcPr>
+          <w:p>
+            <w:r>
+              <w:rPr>
+                <w:rFonts w:ascii="Calibri" w:hAnsi="Calibri"/>
+                <w:b/>
+                <w:color w:val="FFFFFF"/>
+                <w:sz w:val="16"/>
+              </w:rPr>
+              <w:t>Strategic Impact / Action</w:t>
+            </w:r>
+          </w:p>
+        </w:tc>
+      </w:tr>
+      <w:tr>
+        <w:tc>
+          <w:tcPr>
+            <w:tcW w:type="dxa" w:w="2065"/>
+            <w:shd w:fill="EEF2FF"/>
+            <w:tcMar>
+              <w:top w:w="20" w:type="dxa"/>
+              <w:bottom w:w="20" w:type="dxa"/>
+              <w:left w:w="20" w:type="dxa"/>
+              <w:right w:w="20" w:type="dxa"/>
+            </w:tcMar>
+          </w:tcPr>
+          <w:p>
+            <w:r>
+              <w:rPr>
+                <w:rFonts w:ascii="Calibri" w:hAnsi="Calibri"/>
+                <w:b/>
+                <w:color w:val="1E1B4B"/>
+                <w:sz w:val="15"/>
+              </w:rPr>
+              <w:t>Base Plan of Record</w:t>
+            </w:r>
+          </w:p>
+        </w:tc>
+        <w:tc>
+          <w:tcPr>
+            <w:tcW w:type="dxa" w:w="2065"/>
+            <w:shd w:fill="EEF2FF"/>
+            <w:tcMar>
+              <w:top w:w="20" w:type="dxa"/>
+              <w:bottom w:w="20" w:type="dxa"/>
+              <w:left w:w="20" w:type="dxa"/>
+              <w:right w:w="20" w:type="dxa"/>
+            </w:tcMar>
+          </w:tcPr>
+          <w:p>
+            <w:r>
+              <w:rPr>
+                <w:rFonts w:ascii="Calibri" w:hAnsi="Calibri"/>
+                <w:b/>
+                <w:color w:val="1E1B4B"/>
+                <w:sz w:val="15"/>
+              </w:rPr>
+              <w:t>CPL $29.85 | Show 71.0% | Close 17.9%</w:t>
+            </w:r>
+          </w:p>
+        </w:tc>
+        <w:tc>
+          <w:tcPr>
+            <w:tcW w:type="dxa" w:w="2065"/>
+            <w:shd w:fill="EEF2FF"/>
+            <w:tcMar>
+              <w:top w:w="20" w:type="dxa"/>
+              <w:bottom w:w="20" w:type="dxa"/>
+              <w:left w:w="20" w:type="dxa"/>
+              <w:right w:w="20" w:type="dxa"/>
+            </w:tcMar>
+          </w:tcPr>
+          <w:p>
+            <w:r>
+              <w:rPr>
+                <w:rFonts w:ascii="Calibri" w:hAnsi="Calibri"/>
+                <w:b/>
+                <w:color w:val="1E1B4B"/>
+                <w:sz w:val="15"/>
+              </w:rPr>
+              <w:t>$164,175</w:t>
+            </w:r>
+          </w:p>
+        </w:tc>
+        <w:tc>
+          <w:tcPr>
+            <w:tcW w:type="dxa" w:w="2065"/>
+            <w:shd w:fill="EEF2FF"/>
+            <w:tcMar>
+              <w:top w:w="20" w:type="dxa"/>
+              <w:bottom w:w="20" w:type="dxa"/>
+              <w:left w:w="20" w:type="dxa"/>
+              <w:right w:w="20" w:type="dxa"/>
+            </w:tcMar>
+          </w:tcPr>
+          <w:p>
+            <w:r>
+              <w:rPr>
+                <w:rFonts w:ascii="Calibri" w:hAnsi="Calibri"/>
+                <w:b/>
+                <w:color w:val="1E1B4B"/>
+                <w:sz w:val="15"/>
+              </w:rPr>
+              <w:t>+$37,978</w:t>
+            </w:r>
+          </w:p>
+        </w:tc>
+        <w:tc>
+          <w:tcPr>
+            <w:tcW w:type="dxa" w:w="2065"/>
+            <w:shd w:fill="EEF2FF"/>
+            <w:tcMar>
+              <w:top w:w="20" w:type="dxa"/>
+              <w:bottom w:w="20" w:type="dxa"/>
+              <w:left w:w="20" w:type="dxa"/>
+              <w:right w:w="20" w:type="dxa"/>
+            </w:tcMar>
+          </w:tcPr>
+          <w:p>
+            <w:r>
+              <w:rPr>
+                <w:rFonts w:ascii="Calibri" w:hAnsi="Calibri"/>
+                <w:b/>
+                <w:color w:val="1E1B4B"/>
+                <w:sz w:val="15"/>
+              </w:rPr>
+              <w:t>Baseline plan; 2.24x ROAS; $62.12 cost/att demo</w:t>
+            </w:r>
+          </w:p>
+        </w:tc>
+      </w:tr>
+      <w:tr>
+        <w:tc>
+          <w:tcPr>
+            <w:tcW w:type="dxa" w:w="2065"/>
+            <w:shd w:fill="FFFFFF"/>
+            <w:tcMar>
+              <w:top w:w="20" w:type="dxa"/>
+              <w:bottom w:w="20" w:type="dxa"/>
+              <w:left w:w="20" w:type="dxa"/>
+              <w:right w:w="20" w:type="dxa"/>
+            </w:tcMar>
+          </w:tcPr>
+          <w:p>
+            <w:r>
+              <w:rPr>
+                <w:rFonts w:ascii="Calibri" w:hAnsi="Calibri"/>
+                <w:color w:val="1E293B"/>
+                <w:sz w:val="15"/>
+              </w:rPr>
+              <w:t>CPL Inflation</w:t>
+            </w:r>
+          </w:p>
+        </w:tc>
+        <w:tc>
+          <w:tcPr>
+            <w:tcW w:type="dxa" w:w="2065"/>
+            <w:shd w:fill="FFFFFF"/>
+            <w:tcMar>
+              <w:top w:w="20" w:type="dxa"/>
+              <w:bottom w:w="20" w:type="dxa"/>
+              <w:left w:w="20" w:type="dxa"/>
+              <w:right w:w="20" w:type="dxa"/>
+            </w:tcMar>
+          </w:tcPr>
+          <w:p>
+            <w:r>
+              <w:rPr>
+                <w:rFonts w:ascii="Calibri" w:hAnsi="Calibri"/>
+                <w:color w:val="1E293B"/>
+                <w:sz w:val="15"/>
+              </w:rPr>
+              <w:t>Blended CPL rises to $34.00 (+14%)</w:t>
+            </w:r>
+          </w:p>
+        </w:tc>
+        <w:tc>
+          <w:tcPr>
+            <w:tcW w:type="dxa" w:w="2065"/>
+            <w:shd w:fill="FFFFFF"/>
+            <w:tcMar>
+              <w:top w:w="20" w:type="dxa"/>
+              <w:bottom w:w="20" w:type="dxa"/>
+              <w:left w:w="20" w:type="dxa"/>
+              <w:right w:w="20" w:type="dxa"/>
+            </w:tcMar>
+          </w:tcPr>
+          <w:p>
+            <w:r>
+              <w:rPr>
+                <w:rFonts w:ascii="Calibri" w:hAnsi="Calibri"/>
+                <w:color w:val="1E293B"/>
+                <w:sz w:val="15"/>
+              </w:rPr>
+              <w:t>$187,000</w:t>
+            </w:r>
+          </w:p>
+        </w:tc>
+        <w:tc>
+          <w:tcPr>
+            <w:tcW w:type="dxa" w:w="2065"/>
+            <w:shd w:fill="FFFFFF"/>
+            <w:tcMar>
+              <w:top w:w="20" w:type="dxa"/>
+              <w:bottom w:w="20" w:type="dxa"/>
+              <w:left w:w="20" w:type="dxa"/>
+              <w:right w:w="20" w:type="dxa"/>
+            </w:tcMar>
+          </w:tcPr>
+          <w:p>
+            <w:r>
+              <w:rPr>
+                <w:rFonts w:ascii="Calibri" w:hAnsi="Calibri"/>
+                <w:b/>
+                <w:color w:val="1E293B"/>
+                <w:sz w:val="15"/>
+              </w:rPr>
+              <w:t>+$15,153</w:t>
+            </w:r>
+          </w:p>
+        </w:tc>
+        <w:tc>
+          <w:tcPr>
+            <w:tcW w:type="dxa" w:w="2065"/>
+            <w:shd w:fill="FFFFFF"/>
+            <w:tcMar>
+              <w:top w:w="20" w:type="dxa"/>
+              <w:bottom w:w="20" w:type="dxa"/>
+              <w:left w:w="20" w:type="dxa"/>
+              <w:right w:w="20" w:type="dxa"/>
+            </w:tcMar>
+          </w:tcPr>
+          <w:p>
+            <w:r>
+              <w:rPr>
+                <w:rFonts w:ascii="Calibri" w:hAnsi="Calibri"/>
+                <w:color w:val="1E293B"/>
+                <w:sz w:val="15"/>
+              </w:rPr>
+              <w:t>Absorbed by volume buffer; $15k positive margin preserved</w:t>
+            </w:r>
+          </w:p>
+        </w:tc>
+      </w:tr>
+      <w:tr>
+        <w:tc>
+          <w:tcPr>
+            <w:tcW w:type="dxa" w:w="2065"/>
+            <w:shd w:fill="FFFFFF"/>
+            <w:tcMar>
+              <w:top w:w="20" w:type="dxa"/>
+              <w:bottom w:w="20" w:type="dxa"/>
+              <w:left w:w="20" w:type="dxa"/>
+              <w:right w:w="20" w:type="dxa"/>
+            </w:tcMar>
+          </w:tcPr>
+          <w:p>
+            <w:r>
+              <w:rPr>
+                <w:rFonts w:ascii="Calibri" w:hAnsi="Calibri"/>
+                <w:color w:val="1E293B"/>
+                <w:sz w:val="15"/>
+              </w:rPr>
+              <w:t>CPL Stress</w:t>
+            </w:r>
+          </w:p>
+        </w:tc>
+        <w:tc>
+          <w:tcPr>
+            <w:tcW w:type="dxa" w:w="2065"/>
+            <w:shd w:fill="FFFFFF"/>
+            <w:tcMar>
+              <w:top w:w="20" w:type="dxa"/>
+              <w:bottom w:w="20" w:type="dxa"/>
+              <w:left w:w="20" w:type="dxa"/>
+              <w:right w:w="20" w:type="dxa"/>
+            </w:tcMar>
+          </w:tcPr>
+          <w:p>
+            <w:r>
+              <w:rPr>
+                <w:rFonts w:ascii="Calibri" w:hAnsi="Calibri"/>
+                <w:color w:val="1E293B"/>
+                <w:sz w:val="15"/>
+              </w:rPr>
+              <w:t>Blended CPL rises to $36.00 (+21%)</w:t>
+            </w:r>
+          </w:p>
+        </w:tc>
+        <w:tc>
+          <w:tcPr>
+            <w:tcW w:type="dxa" w:w="2065"/>
+            <w:shd w:fill="FFFFFF"/>
+            <w:tcMar>
+              <w:top w:w="20" w:type="dxa"/>
+              <w:bottom w:w="20" w:type="dxa"/>
+              <w:left w:w="20" w:type="dxa"/>
+              <w:right w:w="20" w:type="dxa"/>
+            </w:tcMar>
+          </w:tcPr>
+          <w:p>
+            <w:r>
+              <w:rPr>
+                <w:rFonts w:ascii="Calibri" w:hAnsi="Calibri"/>
+                <w:color w:val="1E293B"/>
+                <w:sz w:val="15"/>
+              </w:rPr>
+              <w:t>$198,000</w:t>
+            </w:r>
+          </w:p>
+        </w:tc>
+        <w:tc>
+          <w:tcPr>
+            <w:tcW w:type="dxa" w:w="2065"/>
+            <w:shd w:fill="FFFFFF"/>
+            <w:tcMar>
+              <w:top w:w="20" w:type="dxa"/>
+              <w:bottom w:w="20" w:type="dxa"/>
+              <w:left w:w="20" w:type="dxa"/>
+              <w:right w:w="20" w:type="dxa"/>
+            </w:tcMar>
+          </w:tcPr>
+          <w:p>
+            <w:r>
+              <w:rPr>
+                <w:rFonts w:ascii="Calibri" w:hAnsi="Calibri"/>
+                <w:b/>
+                <w:color w:val="1E293B"/>
+                <w:sz w:val="15"/>
+              </w:rPr>
+              <w:t>+$4,153</w:t>
+            </w:r>
+          </w:p>
+        </w:tc>
+        <w:tc>
+          <w:tcPr>
+            <w:tcW w:type="dxa" w:w="2065"/>
+            <w:shd w:fill="FFFFFF"/>
+            <w:tcMar>
+              <w:top w:w="20" w:type="dxa"/>
+              <w:bottom w:w="20" w:type="dxa"/>
+              <w:left w:w="20" w:type="dxa"/>
+              <w:right w:w="20" w:type="dxa"/>
+            </w:tcMar>
+          </w:tcPr>
+          <w:p>
+            <w:r>
+              <w:rPr>
+                <w:rFonts w:ascii="Calibri" w:hAnsi="Calibri"/>
+                <w:color w:val="1E293B"/>
+                <w:sz w:val="15"/>
+              </w:rPr>
+              <w:t>Near break-even; reallocate 50% budget to Tier 2/3 &amp; referrals</w:t>
+            </w:r>
+          </w:p>
+        </w:tc>
+      </w:tr>
+      <w:tr>
+        <w:tc>
+          <w:tcPr>
+            <w:tcW w:type="dxa" w:w="2065"/>
+            <w:shd w:fill="FFFFFF"/>
+            <w:tcMar>
+              <w:top w:w="20" w:type="dxa"/>
+              <w:bottom w:w="20" w:type="dxa"/>
+              <w:left w:w="20" w:type="dxa"/>
+              <w:right w:w="20" w:type="dxa"/>
+            </w:tcMar>
+          </w:tcPr>
+          <w:p>
+            <w:r>
+              <w:rPr>
+                <w:rFonts w:ascii="Calibri" w:hAnsi="Calibri"/>
+                <w:color w:val="1E293B"/>
+                <w:sz w:val="15"/>
+              </w:rPr>
+              <w:t>Round 1 Show Rate</w:t>
+            </w:r>
+          </w:p>
+        </w:tc>
+        <w:tc>
+          <w:tcPr>
+            <w:tcW w:type="dxa" w:w="2065"/>
+            <w:shd w:fill="FFFFFF"/>
+            <w:tcMar>
+              <w:top w:w="20" w:type="dxa"/>
+              <w:bottom w:w="20" w:type="dxa"/>
+              <w:left w:w="20" w:type="dxa"/>
+              <w:right w:w="20" w:type="dxa"/>
+            </w:tcMar>
+          </w:tcPr>
+          <w:p>
+            <w:r>
+              <w:rPr>
+                <w:rFonts w:ascii="Calibri" w:hAnsi="Calibri"/>
+                <w:color w:val="1E293B"/>
+                <w:sz w:val="15"/>
+              </w:rPr>
+              <w:t>Show rate drops to R1 actual (64.8%)</w:t>
+            </w:r>
+          </w:p>
+        </w:tc>
+        <w:tc>
+          <w:tcPr>
+            <w:tcW w:type="dxa" w:w="2065"/>
+            <w:shd w:fill="FFFFFF"/>
+            <w:tcMar>
+              <w:top w:w="20" w:type="dxa"/>
+              <w:bottom w:w="20" w:type="dxa"/>
+              <w:left w:w="20" w:type="dxa"/>
+              <w:right w:w="20" w:type="dxa"/>
+            </w:tcMar>
+          </w:tcPr>
+          <w:p>
+            <w:r>
+              <w:rPr>
+                <w:rFonts w:ascii="Calibri" w:hAnsi="Calibri"/>
+                <w:color w:val="1E293B"/>
+                <w:sz w:val="15"/>
+              </w:rPr>
+              <w:t>$164,175</w:t>
+            </w:r>
+          </w:p>
+        </w:tc>
+        <w:tc>
+          <w:tcPr>
+            <w:tcW w:type="dxa" w:w="2065"/>
+            <w:shd w:fill="FFFFFF"/>
+            <w:tcMar>
+              <w:top w:w="20" w:type="dxa"/>
+              <w:bottom w:w="20" w:type="dxa"/>
+              <w:left w:w="20" w:type="dxa"/>
+              <w:right w:w="20" w:type="dxa"/>
+            </w:tcMar>
+          </w:tcPr>
+          <w:p>
+            <w:r>
+              <w:rPr>
+                <w:rFonts w:ascii="Calibri" w:hAnsi="Calibri"/>
+                <w:b/>
+                <w:color w:val="1E293B"/>
+                <w:sz w:val="15"/>
+              </w:rPr>
+              <w:t>+$20,386</w:t>
+            </w:r>
+          </w:p>
+        </w:tc>
+        <w:tc>
+          <w:tcPr>
+            <w:tcW w:type="dxa" w:w="2065"/>
+            <w:shd w:fill="FFFFFF"/>
+            <w:tcMar>
+              <w:top w:w="20" w:type="dxa"/>
+              <w:bottom w:w="20" w:type="dxa"/>
+              <w:left w:w="20" w:type="dxa"/>
+              <w:right w:w="20" w:type="dxa"/>
+            </w:tcMar>
+          </w:tcPr>
+          <w:p>
+            <w:r>
+              <w:rPr>
+                <w:rFonts w:ascii="Calibri" w:hAnsi="Calibri"/>
+                <w:color w:val="1E293B"/>
+                <w:sz w:val="15"/>
+              </w:rPr>
+              <w:t>Volume absorbs decline; +$20k contribution maintained</w:t>
+            </w:r>
+          </w:p>
+        </w:tc>
+      </w:tr>
+      <w:tr>
+        <w:tc>
+          <w:tcPr>
+            <w:tcW w:type="dxa" w:w="2065"/>
+            <w:shd w:fill="FEE2E2"/>
+            <w:tcMar>
+              <w:top w:w="20" w:type="dxa"/>
+              <w:bottom w:w="20" w:type="dxa"/>
+              <w:left w:w="20" w:type="dxa"/>
+              <w:right w:w="20" w:type="dxa"/>
+            </w:tcMar>
+          </w:tcPr>
+          <w:p>
+            <w:r>
+              <w:rPr>
+                <w:rFonts w:ascii="Calibri" w:hAnsi="Calibri"/>
+                <w:color w:val="DC2626"/>
+                <w:sz w:val="15"/>
+              </w:rPr>
+              <w:t>Combined Headwind</w:t>
+            </w:r>
+          </w:p>
+        </w:tc>
+        <w:tc>
+          <w:tcPr>
+            <w:tcW w:type="dxa" w:w="2065"/>
+            <w:shd w:fill="FEE2E2"/>
+            <w:tcMar>
+              <w:top w:w="20" w:type="dxa"/>
+              <w:bottom w:w="20" w:type="dxa"/>
+              <w:left w:w="20" w:type="dxa"/>
+              <w:right w:w="20" w:type="dxa"/>
+            </w:tcMar>
+          </w:tcPr>
+          <w:p>
+            <w:r>
+              <w:rPr>
+                <w:rFonts w:ascii="Calibri" w:hAnsi="Calibri"/>
+                <w:color w:val="DC2626"/>
+                <w:sz w:val="15"/>
+              </w:rPr>
+              <w:t>CPL $34.00 + Show Rate 64.8%</w:t>
+            </w:r>
+          </w:p>
+        </w:tc>
+        <w:tc>
+          <w:tcPr>
+            <w:tcW w:type="dxa" w:w="2065"/>
+            <w:shd w:fill="FEE2E2"/>
+            <w:tcMar>
+              <w:top w:w="20" w:type="dxa"/>
+              <w:bottom w:w="20" w:type="dxa"/>
+              <w:left w:w="20" w:type="dxa"/>
+              <w:right w:w="20" w:type="dxa"/>
+            </w:tcMar>
+          </w:tcPr>
+          <w:p>
+            <w:r>
+              <w:rPr>
+                <w:rFonts w:ascii="Calibri" w:hAnsi="Calibri"/>
+                <w:color w:val="DC2626"/>
+                <w:sz w:val="15"/>
+              </w:rPr>
+              <w:t>$187,000</w:t>
+            </w:r>
+          </w:p>
+        </w:tc>
+        <w:tc>
+          <w:tcPr>
+            <w:tcW w:type="dxa" w:w="2065"/>
+            <w:shd w:fill="FEE2E2"/>
+            <w:tcMar>
+              <w:top w:w="20" w:type="dxa"/>
+              <w:bottom w:w="20" w:type="dxa"/>
+              <w:left w:w="20" w:type="dxa"/>
+              <w:right w:w="20" w:type="dxa"/>
+            </w:tcMar>
+          </w:tcPr>
+          <w:p>
+            <w:r>
+              <w:rPr>
+                <w:rFonts w:ascii="Calibri" w:hAnsi="Calibri"/>
+                <w:b/>
+                <w:color w:val="DC2626"/>
+                <w:sz w:val="15"/>
+              </w:rPr>
+              <w:t>-$2,439</w:t>
+            </w:r>
+          </w:p>
+        </w:tc>
+        <w:tc>
+          <w:tcPr>
+            <w:tcW w:type="dxa" w:w="2065"/>
+            <w:shd w:fill="FEE2E2"/>
+            <w:tcMar>
+              <w:top w:w="20" w:type="dxa"/>
+              <w:bottom w:w="20" w:type="dxa"/>
+              <w:left w:w="20" w:type="dxa"/>
+              <w:right w:w="20" w:type="dxa"/>
+            </w:tcMar>
+          </w:tcPr>
+          <w:p>
+            <w:r>
+              <w:rPr>
+                <w:rFonts w:ascii="Calibri" w:hAnsi="Calibri"/>
+                <w:color w:val="DC2626"/>
+                <w:sz w:val="15"/>
+              </w:rPr>
+              <w:t>Triggers Day-10 kill criteria; enforce OTP &amp; phone confirmation</w:t>
+            </w:r>
+          </w:p>
+        </w:tc>
+      </w:tr>
+    </w:tbl>
     <w:p>
       <w:pPr>
-        <w:spacing w:before="200" w:after="60"/>
+        <w:spacing w:before="180" w:after="60"/>
       </w:pPr>
       <w:r>
         <w:rPr>
           <w:rFonts w:ascii="Calibri" w:hAnsi="Calibri"/>
           <w:b/>
           <w:color w:val="1E1B4B"/>
-          <w:sz w:val="24"/>
+          <w:sz w:val="23"/>
         </w:rPr>
-        <w:t>5. Operations, Capacity, Compliance &amp; Day-1 Test Plan</w:t>
+        <w:t>6. Operations, Capacity, Compliance &amp; Day-10 Test Plan</w:t>
       </w:r>
     </w:p>
     <w:p>
       <w:pPr>
-        <w:spacing w:before="120" w:after="40"/>
+        <w:spacing w:before="100" w:after="40"/>
       </w:pPr>
       <w:r>
         <w:rPr>
           <w:rFonts w:ascii="Calibri" w:hAnsi="Calibri"/>
           <w:b/>
           <w:color w:val="4338CA"/>
-          <w:sz w:val="21"/>
+          <w:sz w:val="20"/>
         </w:rPr>
-        <w:t>Demo Capacity by US Timezone</w:t>
+        <w:t>Demo Capacity &amp; Peak Planning</w:t>
       </w:r>
     </w:p>
     <w:p>
       <w:pPr>
-        <w:spacing w:before="0" w:after="60" w:line="276" w:lineRule="auto"/>
+        <w:spacing w:before="0" w:after="50" w:line="276" w:lineRule="auto"/>
       </w:pPr>
       <w:r>
         <w:rPr>
           <w:rFonts w:ascii="Calibri" w:hAnsi="Calibri"/>
           <w:color w:val="1E293B"/>
-          <w:sz w:val="18"/>
+          <w:sz w:val="17"/>
         </w:rPr>
-        <w:t>Generating 3,723 demos over 60 days requires conducting ~62 demos daily:</w:t>
+        <w:t>• Base Capacity: 3,723 scheduled demos across 60 days = ~62 demos/day (Eastern 40% [25/day] | Central 30% [19/day] | Pacific 30% [18/day]). 16 full-time mentors working 4-hour evening shifts provide 64 mentor-hours vs 46.5 needed (73% utilization).</w:t>
         <w:br/>
-        <w:t>• Eastern (EST): 40% (25 demos/day | 4:30-8:30 PM local) -&gt; 7 FTE Mentors</w:t>
-        <w:br/>
-        <w:t>• Central (CST): 30% (19 demos/day | 4:30-8:30 PM local) -&gt; 5 FTE Mentors</w:t>
-        <w:br/>
-        <w:t>• Pacific (PST): 30% (18 demos/day | 4:30-8:30 PM local) -&gt; 4 FTE Mentors</w:t>
-        <w:br/>
-        <w:t>Total Capacity: 16 dedicated US-shift trial mentors handle full volume with a 15% surge buffer.</w:t>
+        <w:t>• Peak Load (1.6x Surge): Weekend &amp; after-school peaks push demand to ~74.4 hours (&gt;100% capacity). Mitigated by opening Saturday/Sunday daytime blocks (10 AM - 3 PM) and maintaining an on-call pool of 6 flex mentors managed by the US Shift Lead.</w:t>
       </w:r>
     </w:p>
     <w:p>
       <w:pPr>
-        <w:spacing w:before="120" w:after="40"/>
+        <w:spacing w:before="100" w:after="40"/>
       </w:pPr>
       <w:r>
         <w:rPr>
           <w:rFonts w:ascii="Calibri" w:hAnsi="Calibri"/>
           <w:b/>
           <w:color w:val="4338CA"/>
-          <w:sz w:val="21"/>
+          <w:sz w:val="20"/>
         </w:rPr>
-        <w:t>Legal &amp; Platform Compliance</w:t>
+        <w:t>First-10-Days Test Plan &amp; Kill Criteria (Nov 1 - Nov 10)</w:t>
       </w:r>
     </w:p>
     <w:p>
       <w:pPr>
-        <w:spacing w:before="0" w:after="60" w:line="276" w:lineRule="auto"/>
+        <w:spacing w:before="0" w:after="50" w:line="276" w:lineRule="auto"/>
       </w:pPr>
       <w:r>
         <w:rPr>
           <w:rFonts w:ascii="Calibri" w:hAnsi="Calibri"/>
           <w:color w:val="1E293B"/>
-          <w:sz w:val="18"/>
+          <w:sz w:val="17"/>
         </w:rPr>
-        <w:t>• TCPA: Explicit opt-in checkbox, disclosure that purchase is not conditional on consent, one-click opt-out.</w:t>
+        <w:t>• Days 1-3 (Signal &amp; Qualification): Deploy $2,500/day in Dallas &amp; Bay Area. Verify CAPI EMQ &gt; 8.0, raw pass rate (target 80% @ raw CPL &lt;= $23.88), and calendar sync.</w:t>
         <w:br/>
-        <w:t>• COPPA: Parent-facing intake gate. Zero child PII (name, age) sent to Meta; only SHA-256 hashed parent contact data.</w:t>
+        <w:t>• Days 4-7 (Creative &amp; Voucher A/B Testing): A/B test $150 voucher vs control in Tier 1. Test 'Beyond Kumon' vs 'Academic Edge' hooks ($4,000/day).</w:t>
         <w:br/>
-        <w:t>• Meta Minor Policy: Targeting strictly on Parents (Age 30-55). Ad copy emphasizes parental co-learning.</w:t>
+        <w:t>• Days 8-10 (Throughput &amp; Close Audit): First 200+ completed demos. Audit cost per attended demo against $62.12 target.</w:t>
+        <w:br/>
+        <w:t>• Explicit Kill Criteria: (1) If Tier 1 CPL &gt; $42 after 150 leads -&gt; Shift 50% budget to Tier 2 suburban zips; (2) If Booking Rate &lt; 55% -&gt; Switch to 1-step intake form; (3) If Show Rate &lt; 62% -&gt; Mandate phone confirmation calls at T-2 hours.</w:t>
       </w:r>
     </w:p>
     <w:p>
       <w:pPr>
-        <w:spacing w:before="120" w:after="40"/>
+        <w:spacing w:before="180" w:after="60"/>
       </w:pPr>
       <w:r>
         <w:rPr>
           <w:rFonts w:ascii="Calibri" w:hAnsi="Calibri"/>
           <w:b/>
-          <w:color w:val="4338CA"/>
-          <w:sz w:val="21"/>
+          <w:color w:val="1E1B4B"/>
+          <w:sz w:val="23"/>
         </w:rPr>
-        <w:t>Assumptions Register &amp; First-10-Days Test Plan</w:t>
+        <w:t>7. Appendix: Likely Pushbacks &amp; Strategic Defenses</w:t>
       </w:r>
     </w:p>
     <w:p>
       <w:pPr>
-        <w:spacing w:before="0" w:after="60" w:line="276" w:lineRule="auto"/>
+        <w:spacing w:before="0" w:after="50" w:line="276" w:lineRule="auto"/>
       </w:pPr>
       <w:r>
         <w:rPr>
           <w:rFonts w:ascii="Calibri" w:hAnsi="Calibri"/>
           <w:color w:val="1E293B"/>
-          <w:sz w:val="18"/>
+          <w:sz w:val="17"/>
         </w:rPr>
-        <w:t>• Assumptions Register: Blended CPL ($29.85, High Conf, Q3 Meta data) | Show Rate (71%, High Conf, &lt;=48h lock) | Close Rate (17.9%, Med Conf, Senior counselor conversion) | Gross Margin (55%, High Conf, Mentor payout ledger).</w:t>
+        <w:t>1. 'At $36 CPL in Tier 1, isn't margin wiped out?' Answer: Blended break-even is $36.76, while Tier 1 generates $850 Net ARPU and 2.85x ROAS due to 22% close rates. Tier 1 CPL is capped at $42 in the 10-day test plan, and performance is managed weekly via cost per attended demo ($62.12 target) with auto-reallocation to Tier 2.</w:t>
         <w:br/>
-        <w:t>• First-10-Days Plan (Nov 1 - Nov 10): Days 1-3 ($2.5k/day pilot in Dallas &amp; Bay Area, audit CAPI EMQ &gt; 8.0); Days 4-7 (Hook A/B tests 'Beyond Kumon' vs 'Academic Edge', ad-set CPM calibration); Days 8-10 (First 200 completed demos, audit show rate and Stripe payments).</w:t>
+        <w:t>2. 'Why assume 71% show rate when Round 1 US was 64.8%?' Answer: In Round 1, demos scheduled within 24-48h showed 74-78% attendance, but that is correlational. Even if show rate remains at the Round 1 actual of 64.8%, contribution is positive at +$20,386, and our 62% floor triggers phone confirmation gates.</w:t>
         <w:br/>
-        <w:t>• Kill / Pivot Criteria: (1) If Tier 1 CPL &gt; $42 after 150 leads -&gt; Shift 10% budget to Tier 2; (2) If Calendar Booking &lt; 55% -&gt; Activate fallback 1-step sticky form; (3) If Show Rate &lt; 60% -&gt; Mandate manual phone check-in at T-4h.</w:t>
-      </w:r>
-    </w:p>
-    <w:p>
-      <w:pPr>
-        <w:spacing w:before="120" w:after="40"/>
-      </w:pPr>
-      <w:r>
-        <w:rPr>
-          <w:rFonts w:ascii="Calibri" w:hAnsi="Calibri"/>
-          <w:b/>
-          <w:color w:val="4338CA"/>
-          <w:sz w:val="21"/>
-        </w:rPr>
-        <w:t>Pre-Launch Checklist &amp; Decisions Needed from BrightCHAMPS</w:t>
-      </w:r>
-    </w:p>
-    <w:p>
-      <w:pPr>
-        <w:spacing w:before="0" w:after="60" w:line="276" w:lineRule="auto"/>
-      </w:pPr>
-      <w:r>
-        <w:rPr>
-          <w:rFonts w:ascii="Calibri" w:hAnsi="Calibri"/>
-          <w:color w:val="1E293B"/>
-          <w:sz w:val="18"/>
-        </w:rPr>
-        <w:t>• Pre-Launch Checklist: [x] Mutually exclusive geos uploaded; [x] CAPI pipeline verified with monotonic values; [x] Primary optimization set to 'Schedule'; [x] Laptop readiness, SMS OTP &amp; TCPA consent live; [ ] 16 US counselors rostered; [ ] Stripe holiday promo code active.</w:t>
+        <w:t>3. 'What is your LTV and renewal rate assumption?' Answer: On a gross-margin basis, first-order LTV/CAC is 1.23x ($777.06 net ARPU x 55% GM / $347.09 CAC), while revenue ROAS is 2.24x. We deliberately exclude renewal upside for conservatism and request US cohort renewal data from BrightCHAMPS to model lifetime value.</w:t>
         <w:br/>
-        <w:t>• Decisions Needed: (1) Authorize $164,175 media pacing across Nov-Dec; (2) Confirm 16 dedicated US-shift counselors; (3) Authorize $150 holiday scholarship tuition voucher.</w:t>
+        <w:t>4. 'Meta removed ethnic targeting. Why not go broad Advantage+?' Answer: We agree direct ethnic targeting is impossible. That is why we established a 10-15% broad Advantage+ control arm to empirically test whether geo tiers beat the algorithm on cost per attended demo.</w:t>
       </w:r>
     </w:p>
     <w:sectPr>
       <w:pgSz w:w="11909" w:h="16834"/>
-      <w:pgMar w:top="792" w:right="864" w:bottom="792" w:left="864" w:header="720" w:footer="720" w:gutter="0"/>
+      <w:pgMar w:top="720" w:right="792" w:bottom="720" w:left="792" w:header="720" w:footer="720" w:gutter="0"/>
       <w:cols w:space="720"/>
       <w:docGrid w:linePitch="360"/>
     </w:sectPr>

</xml_diff>

<commit_message>
docs: update memo and deck with Tier 3 contribution trade-off and refine canvas title
</commit_message>
<xml_diff>
--- a/deliverables/BrightCHAMPS_USA_Q4_Strategy_Memo.docx
+++ b/deliverables/BrightCHAMPS_USA_Q4_Strategy_Memo.docx
@@ -254,7 +254,7 @@
           <w:color w:val="1E1B4B"/>
           <w:sz w:val="23"/>
         </w:rPr>
-        <w:t>1. Executive Summary &amp; One-Page Strategy Canvas</w:t>
+        <w:t>1. Executive Summary &amp; Growth Strategy Canvas</w:t>
       </w:r>
     </w:p>
     <w:p>
@@ -1921,6 +1921,19 @@
     </w:p>
     <w:p>
       <w:pPr>
+        <w:spacing w:before="0" w:after="50" w:line="276" w:lineRule="auto"/>
+      </w:pPr>
+      <w:r>
+        <w:rPr>
+          <w:rFonts w:ascii="Calibri" w:hAnsi="Calibri"/>
+          <w:color w:val="1E293B"/>
+          <w:sz w:val="17"/>
+        </w:rPr>
+        <w:t>Tier 3 Contribution Trade-Off &amp; Reallocation Lever: Tier 3 is contribution-negative on our model (1.40x ROAS vs 1.82x break-even, -$7.6k contribution loss at 55% GM); it is in the portfolio specifically to hold the $30 blended CPL ceiling ($29.85 blended). Dropping Tier 3 entirely lifts blended CPL across Tiers 1 and 2 to $31.80 ($131,175 spend / 4,125 leads), but immediately increases total contribution by +$7.6k (Tier 1 &amp; 2 blended ROAS is 2.45x). Trimming Tier 3 represents our primary operational reallocation lever if contribution profit takes precedence over the strict $30 CPL ceiling.</w:t>
+      </w:r>
+    </w:p>
+    <w:p>
+      <w:pPr>
         <w:spacing w:before="180" w:after="60"/>
       </w:pPr>
       <w:r>

</xml_diff>